<commit_message>
docs(outputs): update the 3 member excerpts to Nhất's 23/10 revision
Take the per-member Word files from Nhất's second 23/10 revision (D5 moved
to Nhất; A6, B6, C3 added) and fix its layout slips:
- cover: drop 4 blank filler lines so the date stays on page 1
- turn stray page-break paragraphs into page-break-before on the next
  heading, removing the blank pages before Phụ lục G (Minh) and at the end (Nhất)
- Minh's assignment row: A1–A6, C2, C3 in package order

Text matches the new group report section by section. TOC updated in Word.
The group report, workbook and README in the BTL package are still the
22/10 version.

Co-Authored-By: Claude Opus 5.5 <noreply@anthropic.com>
</commit_message>
<xml_diff>
--- a/outputs/Nhom13_PhanViec_ca_nhan/Nhom13_23010636_NghiemDucViet_PhanViec.docx
+++ b/outputs/Nhom13_PhanViec_ca_nhan/Nhom13_23010636_NghiemDucViet_PhanViec.docx
@@ -20,7 +20,7 @@
           <w:sz w:val="36"/>
           <w:szCs w:val="36"/>
         </w:rPr>
-        <w:t>TRƯỜNG ĐẠI HỌC PHENIKAA</w:t>
+        <w:t>ĐẠI HỌC PHENIKAA</w:t>
       </w:r>
     </w:p>
     <w:p>
@@ -41,7 +41,28 @@
           <w:sz w:val="36"/>
           <w:szCs w:val="36"/>
         </w:rPr>
-        <w:t>KHOA CÔNG NGHỆ THÔNG TIN</w:t>
+        <w:t>TRƯỜNG CÔNG NGHỆ THÔNG TIN</w:t>
+      </w:r>
+    </w:p>
+    <w:p>
+      <w:pPr>
+        <w:pStyle w:val="line"/>
+        <w:spacing w:before="220"/>
+        <w:jc w:val="center"/>
+        <w:rPr>
+          <w:rFonts w:ascii="Times New Roman" w:hAnsi="Times New Roman"/>
+          <w:sz w:val="36"/>
+          <w:szCs w:val="36"/>
+          <w:lang w:val="vi-VN"/>
+        </w:rPr>
+      </w:pPr>
+      <w:r>
+        <w:rPr>
+          <w:rFonts w:ascii="Times New Roman" w:hAnsi="Times New Roman"/>
+          <w:sz w:val="36"/>
+          <w:szCs w:val="36"/>
+        </w:rPr>
+        <w:t>KHOA HỆ THỐNG THÔNG TIN</w:t>
       </w:r>
     </w:p>
     <w:p>
@@ -179,30 +200,7 @@
           <w:sz w:val="32"/>
           <w:szCs w:val="32"/>
         </w:rPr>
-        <w:t xml:space="preserve">BÁO CÁO ĐỒ ÁN </w:t>
-      </w:r>
-      <w:r>
-        <w:rPr>
-          <w:rFonts w:ascii="Times New Roman" w:hAnsi="Times New Roman" w:cs="Times New Roman"/>
-          <w:b/>
-          <w:bCs/>
-          <w:color w:val="000000" w:themeColor="text1"/>
-          <w:sz w:val="32"/>
-          <w:szCs w:val="32"/>
-        </w:rPr>
-        <w:t>LIÊN</w:t>
-      </w:r>
-      <w:r>
-        <w:rPr>
-          <w:rFonts w:ascii="Times New Roman" w:hAnsi="Times New Roman" w:cs="Times New Roman"/>
-          <w:b/>
-          <w:bCs/>
-          <w:color w:val="000000" w:themeColor="text1"/>
-          <w:sz w:val="32"/>
-          <w:szCs w:val="32"/>
-          <w:lang w:val="vi-VN"/>
-        </w:rPr>
-        <w:t xml:space="preserve"> NGÀNH</w:t>
+        <w:t>BÁO CÁO ĐỒ ÁN MÔN HỌC AN TOÀN PHẦN MỀM</w:t>
       </w:r>
       <w:r>
         <w:br/>
@@ -227,7 +225,7 @@
           <w:sz w:val="32"/>
           <w:szCs w:val="32"/>
         </w:rPr>
-        <w:t>Phần việc cá nhân (D1, D2, D3, D4, C1) – trích từ báo cáo chung của nhóm</w:t>
+        <w:t>Phần việc cá nhân (D1, D2, D3, D4, C1, C3) – trích từ báo cáo chung của nhóm</w:t>
       </w:r>
       <w:r>
         <w:br/>
@@ -252,7 +250,7 @@
           <w:sz w:val="32"/>
           <w:szCs w:val="32"/>
         </w:rPr>
-        <w:t>Nhóm 13</w:t>
+        <w:t>Đề tài: Static Testing, Đặc tả và Test Case phân hệ thủ thư – Hệ thống quản lý thư viện</w:t>
       </w:r>
       <w:r>
         <w:rPr>
@@ -263,7 +261,7 @@
           <w:szCs w:val="32"/>
         </w:rPr>
         <w:br/>
-        <w:t>Static Testing, Đặc tả và Test Case phân hệ thủ thư – Hệ thống quản lý thư viện</w:t>
+        <w:t>Nhóm: 13</w:t>
       </w:r>
     </w:p>
     <w:p>
@@ -383,7 +381,18 @@
           <w:sz w:val="32"/>
           <w:szCs w:val="32"/>
         </w:rPr>
-        <w:t>Học phần: CSE703093 – An toàn phần mềm</w:t>
+        <w:t>Học phần: An toàn phần mềm</w:t>
+      </w:r>
+      <w:r>
+        <w:rPr>
+          <w:rStyle w:val="fontstyle21"/>
+          <w:rFonts w:ascii="Times New Roman" w:hAnsi="Times New Roman" w:cs="Times New Roman"/>
+          <w:color w:val="000000"/>
+          <w:sz w:val="32"/>
+          <w:szCs w:val="32"/>
+        </w:rPr>
+        <w:br/>
+        <w:t>Mã học phần: CSE703093-1-1-26(N01)</w:t>
       </w:r>
     </w:p>
     <w:p>
@@ -495,62 +504,6 @@
     <w:p>
       <w:pPr>
         <w:pStyle w:val="NoSpacing"/>
-        <w:rPr>
-          <w:rFonts w:ascii="Times New Roman" w:hAnsi="Times New Roman" w:cs="Times New Roman"/>
-          <w:b/>
-          <w:bCs/>
-          <w:color w:val="000000"/>
-          <w:sz w:val="20"/>
-          <w:szCs w:val="20"/>
-        </w:rPr>
-      </w:pPr>
-    </w:p>
-    <w:p>
-      <w:pPr>
-        <w:pStyle w:val="NoSpacing"/>
-        <w:jc w:val="center"/>
-        <w:rPr>
-          <w:rFonts w:ascii="Times New Roman" w:hAnsi="Times New Roman" w:cs="Times New Roman"/>
-          <w:b/>
-          <w:bCs/>
-          <w:color w:val="000000"/>
-          <w:sz w:val="20"/>
-          <w:szCs w:val="20"/>
-        </w:rPr>
-      </w:pPr>
-    </w:p>
-    <w:p>
-      <w:pPr>
-        <w:pStyle w:val="NoSpacing"/>
-        <w:jc w:val="center"/>
-        <w:rPr>
-          <w:rFonts w:ascii="Times New Roman" w:hAnsi="Times New Roman" w:cs="Times New Roman"/>
-          <w:b/>
-          <w:bCs/>
-          <w:color w:val="000000"/>
-          <w:sz w:val="20"/>
-          <w:szCs w:val="20"/>
-        </w:rPr>
-      </w:pPr>
-    </w:p>
-    <w:p>
-      <w:pPr>
-        <w:pStyle w:val="NoSpacing"/>
-        <w:jc w:val="center"/>
-        <w:rPr>
-          <w:rFonts w:ascii="Times New Roman" w:hAnsi="Times New Roman" w:cs="Times New Roman"/>
-          <w:b/>
-          <w:bCs/>
-          <w:color w:val="000000"/>
-          <w:sz w:val="20"/>
-          <w:szCs w:val="20"/>
-        </w:rPr>
-      </w:pPr>
-    </w:p>
-    <w:p>
-      <w:pPr>
-        <w:pStyle w:val="NoSpacing"/>
-        <w:jc w:val="center"/>
         <w:rPr>
           <w:rFonts w:ascii="Times New Roman" w:hAnsi="Times New Roman" w:cs="Times New Roman"/>
           <w:b/>
@@ -658,7 +611,7 @@
           <w:r>
             <w:fldChar w:fldCharType="separate"/>
           </w:r>
-          <w:hyperlink w:anchor="_Toc243599934" w:history="1">
+          <w:hyperlink w:anchor="_Toc243827890" w:history="1">
             <w:r>
               <w:rPr>
                 <w:rStyle w:val="Hyperlink"/>
@@ -685,7 +638,7 @@
                 <w:noProof/>
                 <w:webHidden/>
               </w:rPr>
-              <w:instrText xml:space="preserve"> PAGEREF _Toc243599934 \h </w:instrText>
+              <w:instrText xml:space="preserve"> PAGEREF _Toc243827890 \h </w:instrText>
             </w:r>
             <w:r>
               <w:rPr>
@@ -732,7 +685,7 @@
               <w14:ligatures w14:val="standardContextual"/>
             </w:rPr>
           </w:pPr>
-          <w:hyperlink w:anchor="_Toc243599935" w:history="1">
+          <w:hyperlink w:anchor="_Toc243827891" w:history="1">
             <w:r>
               <w:rPr>
                 <w:rStyle w:val="Hyperlink"/>
@@ -760,7 +713,7 @@
                 <w:noProof/>
                 <w:webHidden/>
               </w:rPr>
-              <w:instrText xml:space="preserve"> PAGEREF _Toc243599935 \h </w:instrText>
+              <w:instrText xml:space="preserve"> PAGEREF _Toc243827891 \h </w:instrText>
             </w:r>
             <w:r>
               <w:rPr>
@@ -780,7 +733,7 @@
                 <w:noProof/>
                 <w:webHidden/>
               </w:rPr>
-              <w:t>2</w:t>
+              <w:t>3</w:t>
             </w:r>
             <w:r>
               <w:rPr>
@@ -806,7 +759,7 @@
               <w14:ligatures w14:val="standardContextual"/>
             </w:rPr>
           </w:pPr>
-          <w:hyperlink w:anchor="_Toc243599936" w:history="1">
+          <w:hyperlink w:anchor="_Toc243827892" w:history="1">
             <w:r>
               <w:rPr>
                 <w:rStyle w:val="Hyperlink"/>
@@ -834,7 +787,7 @@
                 <w:noProof/>
                 <w:webHidden/>
               </w:rPr>
-              <w:instrText xml:space="preserve"> PAGEREF _Toc243599936 \h </w:instrText>
+              <w:instrText xml:space="preserve"> PAGEREF _Toc243827892 \h </w:instrText>
             </w:r>
             <w:r>
               <w:rPr>
@@ -854,7 +807,7 @@
                 <w:noProof/>
                 <w:webHidden/>
               </w:rPr>
-              <w:t>2</w:t>
+              <w:t>3</w:t>
             </w:r>
             <w:r>
               <w:rPr>
@@ -880,7 +833,7 @@
               <w14:ligatures w14:val="standardContextual"/>
             </w:rPr>
           </w:pPr>
-          <w:hyperlink w:anchor="_Toc243599937" w:history="1">
+          <w:hyperlink w:anchor="_Toc243827893" w:history="1">
             <w:r>
               <w:rPr>
                 <w:rStyle w:val="Hyperlink"/>
@@ -908,7 +861,7 @@
                 <w:noProof/>
                 <w:webHidden/>
               </w:rPr>
-              <w:instrText xml:space="preserve"> PAGEREF _Toc243599937 \h </w:instrText>
+              <w:instrText xml:space="preserve"> PAGEREF _Toc243827893 \h </w:instrText>
             </w:r>
             <w:r>
               <w:rPr>
@@ -928,7 +881,7 @@
                 <w:noProof/>
                 <w:webHidden/>
               </w:rPr>
-              <w:t>2</w:t>
+              <w:t>3</w:t>
             </w:r>
             <w:r>
               <w:rPr>
@@ -955,7 +908,7 @@
               <w14:ligatures w14:val="standardContextual"/>
             </w:rPr>
           </w:pPr>
-          <w:hyperlink w:anchor="_Toc243599938" w:history="1">
+          <w:hyperlink w:anchor="_Toc243827894" w:history="1">
             <w:r>
               <w:rPr>
                 <w:rStyle w:val="Hyperlink"/>
@@ -983,7 +936,7 @@
                 <w:noProof/>
                 <w:webHidden/>
               </w:rPr>
-              <w:instrText xml:space="preserve"> PAGEREF _Toc243599938 \h </w:instrText>
+              <w:instrText xml:space="preserve"> PAGEREF _Toc243827894 \h </w:instrText>
             </w:r>
             <w:r>
               <w:rPr>
@@ -1003,7 +956,7 @@
                 <w:noProof/>
                 <w:webHidden/>
               </w:rPr>
-              <w:t>3</w:t>
+              <w:t>4</w:t>
             </w:r>
             <w:r>
               <w:rPr>
@@ -1029,7 +982,7 @@
               <w14:ligatures w14:val="standardContextual"/>
             </w:rPr>
           </w:pPr>
-          <w:hyperlink w:anchor="_Toc243599939" w:history="1">
+          <w:hyperlink w:anchor="_Toc243827895" w:history="1">
             <w:r>
               <w:rPr>
                 <w:rStyle w:val="Hyperlink"/>
@@ -1057,7 +1010,7 @@
                 <w:noProof/>
                 <w:webHidden/>
               </w:rPr>
-              <w:instrText xml:space="preserve"> PAGEREF _Toc243599939 \h </w:instrText>
+              <w:instrText xml:space="preserve"> PAGEREF _Toc243827895 \h </w:instrText>
             </w:r>
             <w:r>
               <w:rPr>
@@ -1077,7 +1030,7 @@
                 <w:noProof/>
                 <w:webHidden/>
               </w:rPr>
-              <w:t>3</w:t>
+              <w:t>4</w:t>
             </w:r>
             <w:r>
               <w:rPr>
@@ -1103,7 +1056,7 @@
               <w14:ligatures w14:val="standardContextual"/>
             </w:rPr>
           </w:pPr>
-          <w:hyperlink w:anchor="_Toc243599940" w:history="1">
+          <w:hyperlink w:anchor="_Toc243827896" w:history="1">
             <w:r>
               <w:rPr>
                 <w:rStyle w:val="Hyperlink"/>
@@ -1131,7 +1084,7 @@
                 <w:noProof/>
                 <w:webHidden/>
               </w:rPr>
-              <w:instrText xml:space="preserve"> PAGEREF _Toc243599940 \h </w:instrText>
+              <w:instrText xml:space="preserve"> PAGEREF _Toc243827896 \h </w:instrText>
             </w:r>
             <w:r>
               <w:rPr>
@@ -1151,7 +1104,7 @@
                 <w:noProof/>
                 <w:webHidden/>
               </w:rPr>
-              <w:t>3</w:t>
+              <w:t>4</w:t>
             </w:r>
             <w:r>
               <w:rPr>
@@ -1177,7 +1130,7 @@
               <w14:ligatures w14:val="standardContextual"/>
             </w:rPr>
           </w:pPr>
-          <w:hyperlink w:anchor="_Toc243599941" w:history="1">
+          <w:hyperlink w:anchor="_Toc243827897" w:history="1">
             <w:r>
               <w:rPr>
                 <w:rStyle w:val="Hyperlink"/>
@@ -1205,7 +1158,7 @@
                 <w:noProof/>
                 <w:webHidden/>
               </w:rPr>
-              <w:instrText xml:space="preserve"> PAGEREF _Toc243599941 \h </w:instrText>
+              <w:instrText xml:space="preserve"> PAGEREF _Toc243827897 \h </w:instrText>
             </w:r>
             <w:r>
               <w:rPr>
@@ -1225,7 +1178,7 @@
                 <w:noProof/>
                 <w:webHidden/>
               </w:rPr>
-              <w:t>4</w:t>
+              <w:t>5</w:t>
             </w:r>
             <w:r>
               <w:rPr>
@@ -1251,7 +1204,7 @@
               <w14:ligatures w14:val="standardContextual"/>
             </w:rPr>
           </w:pPr>
-          <w:hyperlink w:anchor="_Toc243599942" w:history="1">
+          <w:hyperlink w:anchor="_Toc243827898" w:history="1">
             <w:r>
               <w:rPr>
                 <w:rStyle w:val="Hyperlink"/>
@@ -1279,7 +1232,7 @@
                 <w:noProof/>
                 <w:webHidden/>
               </w:rPr>
-              <w:instrText xml:space="preserve"> PAGEREF _Toc243599942 \h </w:instrText>
+              <w:instrText xml:space="preserve"> PAGEREF _Toc243827898 \h </w:instrText>
             </w:r>
             <w:r>
               <w:rPr>
@@ -1299,7 +1252,7 @@
                 <w:noProof/>
                 <w:webHidden/>
               </w:rPr>
-              <w:t>4</w:t>
+              <w:t>5</w:t>
             </w:r>
             <w:r>
               <w:rPr>
@@ -1325,7 +1278,7 @@
               <w14:ligatures w14:val="standardContextual"/>
             </w:rPr>
           </w:pPr>
-          <w:hyperlink w:anchor="_Toc243599943" w:history="1">
+          <w:hyperlink w:anchor="_Toc243827899" w:history="1">
             <w:r>
               <w:rPr>
                 <w:rStyle w:val="Hyperlink"/>
@@ -1353,7 +1306,7 @@
                 <w:noProof/>
                 <w:webHidden/>
               </w:rPr>
-              <w:instrText xml:space="preserve"> PAGEREF _Toc243599943 \h </w:instrText>
+              <w:instrText xml:space="preserve"> PAGEREF _Toc243827899 \h </w:instrText>
             </w:r>
             <w:r>
               <w:rPr>
@@ -1373,7 +1326,7 @@
                 <w:noProof/>
                 <w:webHidden/>
               </w:rPr>
-              <w:t>5</w:t>
+              <w:t>6</w:t>
             </w:r>
             <w:r>
               <w:rPr>
@@ -1399,7 +1352,7 @@
               <w14:ligatures w14:val="standardContextual"/>
             </w:rPr>
           </w:pPr>
-          <w:hyperlink w:anchor="_Toc243599944" w:history="1">
+          <w:hyperlink w:anchor="_Toc243827900" w:history="1">
             <w:r>
               <w:rPr>
                 <w:rStyle w:val="Hyperlink"/>
@@ -1427,7 +1380,7 @@
                 <w:noProof/>
                 <w:webHidden/>
               </w:rPr>
-              <w:instrText xml:space="preserve"> PAGEREF _Toc243599944 \h </w:instrText>
+              <w:instrText xml:space="preserve"> PAGEREF _Toc243827900 \h </w:instrText>
             </w:r>
             <w:r>
               <w:rPr>
@@ -1447,7 +1400,7 @@
                 <w:noProof/>
                 <w:webHidden/>
               </w:rPr>
-              <w:t>7</w:t>
+              <w:t>8</w:t>
             </w:r>
             <w:r>
               <w:rPr>
@@ -1473,7 +1426,7 @@
               <w14:ligatures w14:val="standardContextual"/>
             </w:rPr>
           </w:pPr>
-          <w:hyperlink w:anchor="_Toc243599945" w:history="1">
+          <w:hyperlink w:anchor="_Toc243827901" w:history="1">
             <w:r>
               <w:rPr>
                 <w:rStyle w:val="Hyperlink"/>
@@ -1501,7 +1454,7 @@
                 <w:noProof/>
                 <w:webHidden/>
               </w:rPr>
-              <w:instrText xml:space="preserve"> PAGEREF _Toc243599945 \h </w:instrText>
+              <w:instrText xml:space="preserve"> PAGEREF _Toc243827901 \h </w:instrText>
             </w:r>
             <w:r>
               <w:rPr>
@@ -1521,7 +1474,7 @@
                 <w:noProof/>
                 <w:webHidden/>
               </w:rPr>
-              <w:t>9</w:t>
+              <w:t>10</w:t>
             </w:r>
             <w:r>
               <w:rPr>
@@ -1547,7 +1500,7 @@
               <w14:ligatures w14:val="standardContextual"/>
             </w:rPr>
           </w:pPr>
-          <w:hyperlink w:anchor="_Toc243599946" w:history="1">
+          <w:hyperlink w:anchor="_Toc243827902" w:history="1">
             <w:r>
               <w:rPr>
                 <w:rStyle w:val="Hyperlink"/>
@@ -1575,7 +1528,7 @@
                 <w:noProof/>
                 <w:webHidden/>
               </w:rPr>
-              <w:instrText xml:space="preserve"> PAGEREF _Toc243599946 \h </w:instrText>
+              <w:instrText xml:space="preserve"> PAGEREF _Toc243827902 \h </w:instrText>
             </w:r>
             <w:r>
               <w:rPr>
@@ -1595,7 +1548,7 @@
                 <w:noProof/>
                 <w:webHidden/>
               </w:rPr>
-              <w:t>11</w:t>
+              <w:t>12</w:t>
             </w:r>
             <w:r>
               <w:rPr>
@@ -1622,14 +1575,13 @@
               <w14:ligatures w14:val="standardContextual"/>
             </w:rPr>
           </w:pPr>
-          <w:hyperlink w:anchor="_Toc243599947" w:history="1">
+          <w:hyperlink w:anchor="_Toc243827903" w:history="1">
             <w:r>
               <w:rPr>
                 <w:rStyle w:val="Hyperlink"/>
                 <w:noProof/>
-                <w:lang w:val="vi-VN"/>
-              </w:rPr>
-              <w:t>7. Kết luận, tài liệu tham khảo và phụ lục</w:t>
+              </w:rPr>
+              <w:t>10. Phản biện &amp; Bài học</w:t>
             </w:r>
             <w:r>
               <w:rPr>
@@ -1650,7 +1602,7 @@
                 <w:noProof/>
                 <w:webHidden/>
               </w:rPr>
-              <w:instrText xml:space="preserve"> PAGEREF _Toc243599947 \h </w:instrText>
+              <w:instrText xml:space="preserve"> PAGEREF _Toc243827903 \h </w:instrText>
             </w:r>
             <w:r>
               <w:rPr>
@@ -1670,7 +1622,7 @@
                 <w:noProof/>
                 <w:webHidden/>
               </w:rPr>
-              <w:t>12</w:t>
+              <w:t>13</w:t>
             </w:r>
             <w:r>
               <w:rPr>
@@ -1696,14 +1648,13 @@
               <w14:ligatures w14:val="standardContextual"/>
             </w:rPr>
           </w:pPr>
-          <w:hyperlink w:anchor="_Toc243599948" w:history="1">
+          <w:hyperlink w:anchor="_Toc243827904" w:history="1">
             <w:r>
               <w:rPr>
                 <w:rStyle w:val="Hyperlink"/>
                 <w:noProof/>
-                <w:lang w:val="vi-VN"/>
-              </w:rPr>
-              <w:t>7.2 Tài liệu tham khảo</w:t>
+              </w:rPr>
+              <w:t>10.1 Nếu làm lại từ đầu, nhóm sẽ thiết kế khác ở đâu?</w:t>
             </w:r>
             <w:r>
               <w:rPr>
@@ -1724,7 +1675,7 @@
                 <w:noProof/>
                 <w:webHidden/>
               </w:rPr>
-              <w:instrText xml:space="preserve"> PAGEREF _Toc243599948 \h </w:instrText>
+              <w:instrText xml:space="preserve"> PAGEREF _Toc243827904 \h </w:instrText>
             </w:r>
             <w:r>
               <w:rPr>
@@ -1744,7 +1695,7 @@
                 <w:noProof/>
                 <w:webHidden/>
               </w:rPr>
-              <w:t>12</w:t>
+              <w:t>13</w:t>
             </w:r>
             <w:r>
               <w:rPr>
@@ -1770,14 +1721,13 @@
               <w14:ligatures w14:val="standardContextual"/>
             </w:rPr>
           </w:pPr>
-          <w:hyperlink w:anchor="_Toc243599949" w:history="1">
+          <w:hyperlink w:anchor="_Toc243827905" w:history="1">
             <w:r>
               <w:rPr>
                 <w:rStyle w:val="Hyperlink"/>
                 <w:noProof/>
-                <w:lang w:val="vi-VN"/>
-              </w:rPr>
-              <w:t>7.3 Phụ lục</w:t>
+              </w:rPr>
+              <w:t>10.2 Lỗ hổng nào nhóm nghi còn tồn tại nhưng chưa xác nhận?</w:t>
             </w:r>
             <w:r>
               <w:rPr>
@@ -1798,7 +1748,7 @@
                 <w:noProof/>
                 <w:webHidden/>
               </w:rPr>
-              <w:instrText xml:space="preserve"> PAGEREF _Toc243599949 \h </w:instrText>
+              <w:instrText xml:space="preserve"> PAGEREF _Toc243827905 \h </w:instrText>
             </w:r>
             <w:r>
               <w:rPr>
@@ -1818,7 +1768,303 @@
                 <w:noProof/>
                 <w:webHidden/>
               </w:rPr>
+              <w:t>13</w:t>
+            </w:r>
+            <w:r>
+              <w:rPr>
+                <w:noProof/>
+                <w:webHidden/>
+              </w:rPr>
+              <w:fldChar w:fldCharType="end"/>
+            </w:r>
+          </w:hyperlink>
+        </w:p>
+        <w:p>
+          <w:pPr>
+            <w:pStyle w:val="TOC2"/>
+            <w:rPr>
+              <w:rFonts w:asciiTheme="minorHAnsi" w:eastAsiaTheme="minorEastAsia" w:hAnsiTheme="minorHAnsi" w:cstheme="minorBidi"/>
+              <w:bCs w:val="0"/>
+              <w:iCs w:val="0"/>
+              <w:noProof/>
+              <w:kern w:val="2"/>
+              <w:sz w:val="24"/>
+              <w:szCs w:val="24"/>
+              <w:lang w:val="en-VN" w:eastAsia="en-US"/>
+              <w14:ligatures w14:val="standardContextual"/>
+            </w:rPr>
+          </w:pPr>
+          <w:hyperlink w:anchor="_Toc243827906" w:history="1">
+            <w:r>
+              <w:rPr>
+                <w:rStyle w:val="Hyperlink"/>
+                <w:noProof/>
+              </w:rPr>
+              <w:t>10.3 Bài học lớn nhất về phương pháp</w:t>
+            </w:r>
+            <w:r>
+              <w:rPr>
+                <w:noProof/>
+                <w:webHidden/>
+              </w:rPr>
+              <w:tab/>
+            </w:r>
+            <w:r>
+              <w:rPr>
+                <w:noProof/>
+                <w:webHidden/>
+              </w:rPr>
+              <w:fldChar w:fldCharType="begin"/>
+            </w:r>
+            <w:r>
+              <w:rPr>
+                <w:noProof/>
+                <w:webHidden/>
+              </w:rPr>
+              <w:instrText xml:space="preserve"> PAGEREF _Toc243827906 \h </w:instrText>
+            </w:r>
+            <w:r>
+              <w:rPr>
+                <w:noProof/>
+                <w:webHidden/>
+              </w:rPr>
+            </w:r>
+            <w:r>
+              <w:rPr>
+                <w:noProof/>
+                <w:webHidden/>
+              </w:rPr>
+              <w:fldChar w:fldCharType="separate"/>
+            </w:r>
+            <w:r>
+              <w:rPr>
+                <w:noProof/>
+                <w:webHidden/>
+              </w:rPr>
+              <w:t>14</w:t>
+            </w:r>
+            <w:r>
+              <w:rPr>
+                <w:noProof/>
+                <w:webHidden/>
+              </w:rPr>
+              <w:fldChar w:fldCharType="end"/>
+            </w:r>
+          </w:hyperlink>
+        </w:p>
+        <w:p>
+          <w:pPr>
+            <w:pStyle w:val="TOC1"/>
+            <w:rPr>
+              <w:rFonts w:asciiTheme="minorHAnsi" w:eastAsiaTheme="minorEastAsia" w:hAnsiTheme="minorHAnsi" w:cstheme="minorBidi"/>
+              <w:b w:val="0"/>
+              <w:bCs w:val="0"/>
+              <w:iCs w:val="0"/>
+              <w:noProof/>
+              <w:kern w:val="2"/>
+              <w:sz w:val="24"/>
+              <w:szCs w:val="24"/>
+              <w:lang w:val="en-VN" w:eastAsia="en-US"/>
+              <w14:ligatures w14:val="standardContextual"/>
+            </w:rPr>
+          </w:pPr>
+          <w:hyperlink w:anchor="_Toc243827907" w:history="1">
+            <w:r>
+              <w:rPr>
+                <w:rStyle w:val="Hyperlink"/>
+                <w:noProof/>
+                <w:lang w:val="vi-VN"/>
+              </w:rPr>
+              <w:t>11. Kết luận, tài liệu tham khảo và phụ lục</w:t>
+            </w:r>
+            <w:r>
+              <w:rPr>
+                <w:noProof/>
+                <w:webHidden/>
+              </w:rPr>
+              <w:tab/>
+            </w:r>
+            <w:r>
+              <w:rPr>
+                <w:noProof/>
+                <w:webHidden/>
+              </w:rPr>
+              <w:fldChar w:fldCharType="begin"/>
+            </w:r>
+            <w:r>
+              <w:rPr>
+                <w:noProof/>
+                <w:webHidden/>
+              </w:rPr>
+              <w:instrText xml:space="preserve"> PAGEREF _Toc243827907 \h </w:instrText>
+            </w:r>
+            <w:r>
+              <w:rPr>
+                <w:noProof/>
+                <w:webHidden/>
+              </w:rPr>
+            </w:r>
+            <w:r>
+              <w:rPr>
+                <w:noProof/>
+                <w:webHidden/>
+              </w:rPr>
+              <w:fldChar w:fldCharType="separate"/>
+            </w:r>
+            <w:r>
+              <w:rPr>
+                <w:noProof/>
+                <w:webHidden/>
+              </w:rPr>
               <w:t>15</w:t>
+            </w:r>
+            <w:r>
+              <w:rPr>
+                <w:noProof/>
+                <w:webHidden/>
+              </w:rPr>
+              <w:fldChar w:fldCharType="end"/>
+            </w:r>
+          </w:hyperlink>
+        </w:p>
+        <w:p>
+          <w:pPr>
+            <w:pStyle w:val="TOC2"/>
+            <w:rPr>
+              <w:rFonts w:asciiTheme="minorHAnsi" w:eastAsiaTheme="minorEastAsia" w:hAnsiTheme="minorHAnsi" w:cstheme="minorBidi"/>
+              <w:bCs w:val="0"/>
+              <w:iCs w:val="0"/>
+              <w:noProof/>
+              <w:kern w:val="2"/>
+              <w:sz w:val="24"/>
+              <w:szCs w:val="24"/>
+              <w:lang w:val="en-VN" w:eastAsia="en-US"/>
+              <w14:ligatures w14:val="standardContextual"/>
+            </w:rPr>
+          </w:pPr>
+          <w:hyperlink w:anchor="_Toc243827908" w:history="1">
+            <w:r>
+              <w:rPr>
+                <w:rStyle w:val="Hyperlink"/>
+                <w:noProof/>
+                <w:lang w:val="vi-VN"/>
+              </w:rPr>
+              <w:t>11.2 Tài liệu tham khảo</w:t>
+            </w:r>
+            <w:r>
+              <w:rPr>
+                <w:noProof/>
+                <w:webHidden/>
+              </w:rPr>
+              <w:tab/>
+            </w:r>
+            <w:r>
+              <w:rPr>
+                <w:noProof/>
+                <w:webHidden/>
+              </w:rPr>
+              <w:fldChar w:fldCharType="begin"/>
+            </w:r>
+            <w:r>
+              <w:rPr>
+                <w:noProof/>
+                <w:webHidden/>
+              </w:rPr>
+              <w:instrText xml:space="preserve"> PAGEREF _Toc243827908 \h </w:instrText>
+            </w:r>
+            <w:r>
+              <w:rPr>
+                <w:noProof/>
+                <w:webHidden/>
+              </w:rPr>
+            </w:r>
+            <w:r>
+              <w:rPr>
+                <w:noProof/>
+                <w:webHidden/>
+              </w:rPr>
+              <w:fldChar w:fldCharType="separate"/>
+            </w:r>
+            <w:r>
+              <w:rPr>
+                <w:noProof/>
+                <w:webHidden/>
+              </w:rPr>
+              <w:t>15</w:t>
+            </w:r>
+            <w:r>
+              <w:rPr>
+                <w:noProof/>
+                <w:webHidden/>
+              </w:rPr>
+              <w:fldChar w:fldCharType="end"/>
+            </w:r>
+          </w:hyperlink>
+        </w:p>
+        <w:p>
+          <w:pPr>
+            <w:pStyle w:val="TOC2"/>
+            <w:rPr>
+              <w:rFonts w:asciiTheme="minorHAnsi" w:eastAsiaTheme="minorEastAsia" w:hAnsiTheme="minorHAnsi" w:cstheme="minorBidi"/>
+              <w:bCs w:val="0"/>
+              <w:iCs w:val="0"/>
+              <w:noProof/>
+              <w:kern w:val="2"/>
+              <w:sz w:val="24"/>
+              <w:szCs w:val="24"/>
+              <w:lang w:val="en-VN" w:eastAsia="en-US"/>
+              <w14:ligatures w14:val="standardContextual"/>
+            </w:rPr>
+          </w:pPr>
+          <w:hyperlink w:anchor="_Toc243827909" w:history="1">
+            <w:r>
+              <w:rPr>
+                <w:rStyle w:val="Hyperlink"/>
+                <w:noProof/>
+                <w:lang w:val="vi-VN"/>
+              </w:rPr>
+              <w:t>11.3 Phụ lục</w:t>
+            </w:r>
+            <w:r>
+              <w:rPr>
+                <w:noProof/>
+                <w:webHidden/>
+              </w:rPr>
+              <w:tab/>
+            </w:r>
+            <w:r>
+              <w:rPr>
+                <w:noProof/>
+                <w:webHidden/>
+              </w:rPr>
+              <w:fldChar w:fldCharType="begin"/>
+            </w:r>
+            <w:r>
+              <w:rPr>
+                <w:noProof/>
+                <w:webHidden/>
+              </w:rPr>
+              <w:instrText xml:space="preserve"> PAGEREF _Toc243827909 \h </w:instrText>
+            </w:r>
+            <w:r>
+              <w:rPr>
+                <w:noProof/>
+                <w:webHidden/>
+              </w:rPr>
+            </w:r>
+            <w:r>
+              <w:rPr>
+                <w:noProof/>
+                <w:webHidden/>
+              </w:rPr>
+              <w:fldChar w:fldCharType="separate"/>
+            </w:r>
+            <w:r>
+              <w:rPr>
+                <w:noProof/>
+                <w:webHidden/>
+              </w:rPr>
+              <w:t>18</w:t>
             </w:r>
             <w:r>
               <w:rPr>
@@ -1844,14 +2090,14 @@
               <w14:ligatures w14:val="standardContextual"/>
             </w:rPr>
           </w:pPr>
-          <w:hyperlink w:anchor="_Toc243599950" w:history="1">
+          <w:hyperlink w:anchor="_Toc243827910" w:history="1">
             <w:r>
               <w:rPr>
                 <w:rStyle w:val="Hyperlink"/>
                 <w:noProof/>
                 <w:lang w:val="vi-VN"/>
               </w:rPr>
-              <w:t>7.3.8 Phụ lục H – Mô hình trạng thái và so sánh trước, sau khi sửa</w:t>
+              <w:t>11.3.8 Phụ lục H – Mô hình trạng thái và so sánh trước, sau khi sửa</w:t>
             </w:r>
             <w:r>
               <w:rPr>
@@ -1872,7 +2118,7 @@
                 <w:noProof/>
                 <w:webHidden/>
               </w:rPr>
-              <w:instrText xml:space="preserve"> PAGEREF _Toc243599950 \h </w:instrText>
+              <w:instrText xml:space="preserve"> PAGEREF _Toc243827910 \h </w:instrText>
             </w:r>
             <w:r>
               <w:rPr>
@@ -1892,7 +2138,7 @@
                 <w:noProof/>
                 <w:webHidden/>
               </w:rPr>
-              <w:t>15</w:t>
+              <w:t>18</w:t>
             </w:r>
             <w:r>
               <w:rPr>
@@ -1922,7 +2168,7 @@
         </w:numPr>
       </w:pPr>
       <w:bookmarkStart w:id="5" w:name="_Toc175554962"/>
-      <w:bookmarkStart w:id="6" w:name="_Toc243599934"/>
+      <w:bookmarkStart w:id="6" w:name="_Toc243827890"/>
       <w:r>
         <w:t>Phân công thực hiện đồ án</w:t>
       </w:r>
@@ -2076,7 +2322,7 @@
                 <w:szCs w:val="22"/>
                 <w:lang w:val="vi-VN"/>
               </w:rPr>
-              <w:t>D1, D2, D3, D4, C1</w:t>
+              <w:t>D1, D2, D3, D4, C1, C3</w:t>
             </w:r>
           </w:p>
         </w:tc>
@@ -2095,7 +2341,7 @@
         <w:pStyle w:val="csparagraph"/>
       </w:pPr>
       <w:r>
-        <w:t>Cột "Nhiệm vụ" ghi các mã nhiệm vụ theo danh mục dưới đây (mảng (A) Static testing, mảng (B) Đặc tả và test case, (C) công việc chung, (D) kiểm chứng hình thức và bộ nhớ).</w:t>
+        <w:t>Cột "Nhiệm vụ" ghi các mã nhiệm vụ theo danh mục dưới đây (mảng (A) Static testing, mảng (B) Đặc tả và test case, (C) công việc chung, (D) kiểm chứng hình thức, bộ nhớ và vá lỗi).</w:t>
       </w:r>
     </w:p>
     <w:tbl>
@@ -2293,7 +2539,7 @@
               <w:rPr>
                 <w:lang w:val="vi-VN"/>
               </w:rPr>
-              <w:t>D1</w:t>
+              <w:t>C3</w:t>
             </w:r>
           </w:p>
         </w:tc>
@@ -2310,7 +2556,7 @@
               <w:rPr>
                 <w:lang w:val="vi-VN"/>
               </w:rPr>
-              <w:t>(D) Hình thức &amp; bộ nhớ</w:t>
+              <w:t>Chung</w:t>
             </w:r>
           </w:p>
         </w:tc>
@@ -2327,7 +2573,7 @@
               <w:rPr>
                 <w:lang w:val="vi-VN"/>
               </w:rPr>
-              <w:t>Sinh mã _v0/_v1 cho 5 chức năng và 54 truy vấn SQL; lint, Semgrep trên mã sinh</w:t>
+              <w:t>Phản biện và bài học về phương pháp</w:t>
             </w:r>
           </w:p>
         </w:tc>
@@ -2344,7 +2590,7 @@
               <w:rPr>
                 <w:lang w:val="vi-VN"/>
               </w:rPr>
-              <w:t>Mã _v0/_v1 (Phụ lục H)</w:t>
+              <w:t>Chương 10</w:t>
             </w:r>
           </w:p>
         </w:tc>
@@ -2366,7 +2612,7 @@
               <w:rPr>
                 <w:lang w:val="vi-VN"/>
               </w:rPr>
-              <w:t>D2</w:t>
+              <w:t>D1</w:t>
             </w:r>
           </w:p>
         </w:tc>
@@ -2400,7 +2646,7 @@
               <w:rPr>
                 <w:lang w:val="vi-VN"/>
               </w:rPr>
-              <w:t>Mô hình hóa xác thực, phân quyền, SQL thành CNF; giải DPLL, đối chiếu Z3</w:t>
+              <w:t>Sinh mã _v0/_v1 cho 5 chức năng và 54 truy vấn SQL; lint, Semgrep trên mã sinh</w:t>
             </w:r>
           </w:p>
         </w:tc>
@@ -2417,7 +2663,7 @@
               <w:rPr>
                 <w:lang w:val="vi-VN"/>
               </w:rPr>
-              <w:t>178 bài toán SAT (mục 5.1.6)</w:t>
+              <w:t>Mã _v0/_v1 (Phụ lục H)</w:t>
             </w:r>
           </w:p>
         </w:tc>
@@ -2439,7 +2685,7 @@
               <w:rPr>
                 <w:lang w:val="vi-VN"/>
               </w:rPr>
-              <w:t>D3</w:t>
+              <w:t>D2</w:t>
             </w:r>
           </w:p>
         </w:tc>
@@ -2473,7 +2719,7 @@
               <w:rPr>
                 <w:lang w:val="vi-VN"/>
               </w:rPr>
-              <w:t>Mô hình hóa guard, token, độ dài khóa, secret key bằng SMT/Z3</w:t>
+              <w:t>Mô hình hóa xác thực, phân quyền, SQL thành CNF; giải DPLL, đối chiếu Z3</w:t>
             </w:r>
           </w:p>
         </w:tc>
@@ -2490,7 +2736,7 @@
               <w:rPr>
                 <w:lang w:val="vi-VN"/>
               </w:rPr>
-              <w:t>562 bài toán SMT (mục 5.1.6)</w:t>
+              <w:t>178 bài toán SAT (mục 5.1.6)</w:t>
             </w:r>
           </w:p>
         </w:tc>
@@ -2512,6 +2758,79 @@
               <w:rPr>
                 <w:lang w:val="vi-VN"/>
               </w:rPr>
+              <w:t>D3</w:t>
+            </w:r>
+          </w:p>
+        </w:tc>
+        <w:tc>
+          <w:tcPr>
+            <w:tcW w:w="1497" w:type="dxa"/>
+            <w:vAlign w:val="center"/>
+          </w:tcPr>
+          <w:p>
+            <w:pPr>
+              <w:jc w:val="left"/>
+            </w:pPr>
+            <w:r>
+              <w:rPr>
+                <w:lang w:val="vi-VN"/>
+              </w:rPr>
+              <w:t>(D) Hình thức &amp; bộ nhớ</w:t>
+            </w:r>
+          </w:p>
+        </w:tc>
+        <w:tc>
+          <w:tcPr>
+            <w:tcW w:w="4399" w:type="dxa"/>
+            <w:vAlign w:val="center"/>
+          </w:tcPr>
+          <w:p>
+            <w:pPr>
+              <w:jc w:val="left"/>
+            </w:pPr>
+            <w:r>
+              <w:rPr>
+                <w:lang w:val="vi-VN"/>
+              </w:rPr>
+              <w:t>Mô hình hóa guard, token, độ dài khóa, secret key bằng SMT/Z3</w:t>
+            </w:r>
+          </w:p>
+        </w:tc>
+        <w:tc>
+          <w:tcPr>
+            <w:tcW w:w="2809" w:type="dxa"/>
+            <w:vAlign w:val="center"/>
+          </w:tcPr>
+          <w:p>
+            <w:pPr>
+              <w:jc w:val="left"/>
+            </w:pPr>
+            <w:r>
+              <w:rPr>
+                <w:lang w:val="vi-VN"/>
+              </w:rPr>
+              <w:t>562 bài toán SMT (mục 5.1.6)</w:t>
+            </w:r>
+          </w:p>
+        </w:tc>
+      </w:tr>
+      <w:tr>
+        <w:trPr>
+          <w:cantSplit/>
+        </w:trPr>
+        <w:tc>
+          <w:tcPr>
+            <w:tcW w:w="655" w:type="dxa"/>
+            <w:vAlign w:val="center"/>
+          </w:tcPr>
+          <w:p>
+            <w:pPr>
+              <w:jc w:val="center"/>
+            </w:pPr>
+            <w:r>
+              <w:rPr>
+                <w:lang w:val="vi-VN"/>
+              </w:rPr>
               <w:t>D4</w:t>
             </w:r>
           </w:p>
@@ -2569,6 +2888,22 @@
         </w:tc>
       </w:tr>
     </w:tbl>
+    <w:p>
+      <w:pPr>
+        <w:pStyle w:val="csparagraph"/>
+      </w:pPr>
+      <w:r>
+        <w:rPr>
+          <w:b/>
+          <w:bCs/>
+        </w:rPr>
+        <w:lastRenderedPageBreak/>
+        <w:t>Ghi chú khi đọc.</w:t>
+      </w:r>
+      <w:r>
+        <w:t xml:space="preserve"> Tài liệu này trích nguyên văn các phần do sinh viên thực hiện từ báo cáo chung của nhóm, giữ nguyên số chương, mục, bảng và hình của báo cáo chung. Tham chiếu tới bảng, hình hoặc mục không có trong tài liệu này trỏ tới báo cáo chung (Nhom_13_Bao_cao_Static_Testing_Thu_vien). Chương 10 là phần chung của cả nhóm (gói C3).</w:t>
+      </w:r>
+    </w:p>
     <w:p>
       <w:pPr>
         <w:spacing w:after="0" w:line="160" w:lineRule="exact"/>
@@ -2586,7 +2921,7 @@
           <w:numId w:val="0"/>
         </w:numPr>
       </w:pPr>
-      <w:bookmarkStart w:id="7" w:name="_Toc243599935"/>
+      <w:bookmarkStart w:id="7" w:name="_Toc243827891"/>
       <w:r>
         <w:rPr>
           <w:lang w:val="vi-VN"/>
@@ -2604,7 +2939,7 @@
           <w:numId w:val="0"/>
         </w:numPr>
       </w:pPr>
-      <w:bookmarkStart w:id="8" w:name="_Toc243599936"/>
+      <w:bookmarkStart w:id="8" w:name="_Toc243827892"/>
       <w:r>
         <w:rPr>
           <w:lang w:val="vi-VN"/>
@@ -2622,7 +2957,7 @@
           <w:numId w:val="0"/>
         </w:numPr>
       </w:pPr>
-      <w:bookmarkStart w:id="9" w:name="_Toc243599937"/>
+      <w:bookmarkStart w:id="9" w:name="_Toc243827893"/>
       <w:r>
         <w:rPr>
           <w:lang w:val="vi-VN"/>
@@ -2765,18 +3100,7 @@
         <w:pStyle w:val="csparagraph"/>
       </w:pPr>
       <w:r>
-        <w:t xml:space="preserve">Phần kiểm chứng này chỉ là bổ trợ. Phép dịch từ PHP sang mô hình được làm thủ công, và UNSAT chỉ có ý nghĩa trong phạm vi trừu tượng đã khai báo. Mã </w:t>
-      </w:r>
-      <w:r>
-        <w:rPr>
-          <w:rFonts w:ascii="Consolas" w:hAnsi="Consolas" w:cs="Consolas"/>
-          <w:sz w:val="24"/>
-          <w:szCs w:val="24"/>
-        </w:rPr>
-        <w:t>_v1</w:t>
-      </w:r>
-      <w:r>
-        <w:t xml:space="preserve"> chưa được tích hợp vào baseline. Kết quả được tóm tắt ở mục 5.1.6; chi tiết từng bài toán nằm trong các sheet </w:t>
+        <w:t xml:space="preserve">Phần kiểm chứng này chỉ là bổ trợ. Phép dịch từ PHP sang mô hình được làm thủ công, và UNSAT chỉ có ý nghĩa trong phạm vi trừu tượng đã khai báo. Mã _v1 minh họa không được tích hợp vào baseline; bản vá thật của baseline là source_v1, trình bày ở Chương 7. Kết quả được tóm tắt ở mục 5.1.6; chi tiết từng bài toán nằm trong các sheet </w:t>
       </w:r>
       <w:r>
         <w:rPr>
@@ -2810,7 +3134,7 @@
           <w:numId w:val="0"/>
         </w:numPr>
       </w:pPr>
-      <w:bookmarkStart w:id="10" w:name="_Toc243599938"/>
+      <w:bookmarkStart w:id="10" w:name="_Toc243827894"/>
       <w:r>
         <w:rPr>
           <w:lang w:val="vi-VN"/>
@@ -2828,7 +3152,7 @@
           <w:numId w:val="0"/>
         </w:numPr>
       </w:pPr>
-      <w:bookmarkStart w:id="11" w:name="_Toc243599939"/>
+      <w:bookmarkStart w:id="11" w:name="_Toc243827895"/>
       <w:r>
         <w:rPr>
           <w:lang w:val="vi-VN"/>
@@ -2846,7 +3170,7 @@
           <w:numId w:val="0"/>
         </w:numPr>
       </w:pPr>
-      <w:bookmarkStart w:id="12" w:name="_Toc243599940"/>
+      <w:bookmarkStart w:id="12" w:name="_Toc243827896"/>
       <w:r>
         <w:rPr>
           <w:lang w:val="vi-VN"/>
@@ -2860,7 +3184,7 @@
         <w:pStyle w:val="csparagraph"/>
       </w:pPr>
       <w:r>
-        <w:t>Bảng 30 tóm tắt 740 bài toán SAT và SMT. Tất cả đều cho kết quả đúng kỳ vọng, và ba bộ kiểm tra DPLL, Z3 và bảng chân trị trùng nhau trên mọi công thức CNF.</w:t>
+        <w:t>Bảng 32 tóm tắt 740 bài toán SAT và SMT. Tất cả đều cho kết quả đúng kỳ vọng, và ba bộ kiểm tra DPLL, Z3 và bảng chân trị trùng nhau trên mọi công thức CNF.</w:t>
       </w:r>
     </w:p>
     <w:p>
@@ -2879,7 +3203,7 @@
         <w:rPr>
           <w:noProof/>
         </w:rPr>
-        <w:t>30</w:t>
+        <w:t>32</w:t>
       </w:r>
       <w:r>
         <w:rPr>
@@ -3351,7 +3675,7 @@
         <w:pStyle w:val="csparagraph"/>
       </w:pPr>
       <w:r>
-        <w:t xml:space="preserve">Kết quả B ở 35 truy vấn có tham số khớp với phân loại ở Bảng 27: trong mô hình, trước khi sửa tồn tại trường hợp dữ liệu không tin cậy đi vào truy vấn chưa bind. Mười chín truy vấn hằng cho UNSAT cả trước và sau khi sửa, nên không bị tính là lỗ hổng. Các kết quả này chỉ chứng minh rằng điều kiện bảo vệ của mã </w:t>
+        <w:t xml:space="preserve">Kết quả B ở 35 truy vấn có tham số khớp với phân loại ở Bảng 29: trong mô hình, trước khi sửa tồn tại trường hợp dữ liệu không tin cậy đi vào truy vấn chưa bind. Mười chín truy vấn hằng cho UNSAT cả trước và sau khi sửa, nên không bị tính là lỗ hổng. Các kết quả này chỉ chứng minh rằng điều kiện bảo vệ của mã </w:t>
       </w:r>
       <w:r>
         <w:rPr>
@@ -3403,7 +3727,7 @@
         <w:t>EF(authenticated)</w:t>
       </w:r>
       <w:r>
-        <w:t xml:space="preserve"> thỏa, cho thấy cả hai nhánh đăng nhập đều đạt được trong mô hình. Bảng 64 (Phụ lục H) tóm tắt kết quả. Mô hình giả định endpoint được gọi trực tiếp và truy vấn thành công, nên không chứng minh tính sống của hệ thống thật.</w:t>
+        <w:t xml:space="preserve"> thỏa, cho thấy cả hai nhánh đăng nhập đều đạt được trong mô hình. Bảng 68 (Phụ lục H) tóm tắt kết quả. Mô hình giả định endpoint được gọi trực tiếp và truy vấn thành công, nên không chứng minh tính sống của hệ thống thật.</w:t>
       </w:r>
     </w:p>
     <w:p>
@@ -3412,7 +3736,7 @@
       </w:pPr>
       <w:r>
         <w:lastRenderedPageBreak/>
-        <w:t>Bảng 65 (Phụ lục H) đặt cạnh nhau kết quả trước sửa (_v0) và sau sửa (_v1) trên cùng phép kiểm tra. Bộ sáu rule Semgrep dành cho mã sinh giảm từ 8 hit xuống 0 trên năm cặp chức năng và từ 54 hit xuống 0 trên 54 cặp wrapper SQL. Năm thuộc tính chức năng chuyển từ SAT sang UNSAT, và 35 truy vấn có tham số cũng chuyển từ SAT sang UNSAT. Đây là so sánh trên mã minh họa, không phải trên baseline đã được sửa.</w:t>
+        <w:t>Bảng 69 (Phụ lục H) đặt cạnh nhau kết quả trước sửa (_v0) và sau sửa (_v1) trên cùng phép kiểm tra. Bộ sáu rule Semgrep dành cho mã sinh giảm từ 8 hit xuống 0 trên năm cặp chức năng và từ 54 hit xuống 0 trên 54 cặp wrapper SQL. Năm thuộc tính chức năng chuyển từ SAT sang UNSAT, và 35 truy vấn có tham số cũng chuyển từ SAT sang UNSAT. Đây là so sánh trên mã minh họa; so sánh trên chính baseline đã vá (source_v1) nằm ở Chương 8.</w:t>
       </w:r>
     </w:p>
     <w:p>
@@ -3423,7 +3747,7 @@
           <w:numId w:val="0"/>
         </w:numPr>
       </w:pPr>
-      <w:bookmarkStart w:id="14" w:name="_Toc243599941"/>
+      <w:bookmarkStart w:id="14" w:name="_Toc243827897"/>
       <w:r>
         <w:rPr>
           <w:lang w:val="vi-VN"/>
@@ -3459,7 +3783,7 @@
           <w:numId w:val="0"/>
         </w:numPr>
       </w:pPr>
-      <w:bookmarkStart w:id="15" w:name="_Toc243599942"/>
+      <w:bookmarkStart w:id="15" w:name="_Toc243827898"/>
       <w:r>
         <w:rPr>
           <w:lang w:val="vi-VN"/>
@@ -3536,7 +3860,7 @@
         <w:pStyle w:val="csparagraph"/>
       </w:pPr>
       <w:r>
-        <w:t xml:space="preserve">Mỗi giá trị được theo dõi (result set, kết nối, statement PDO, mảng dòng, chuỗi bí mật) là một đối tượng có trạng thái riêng, theo ý tưởng typestate [30]. Bảng 37 liệt kê 13 trạng thái. Với mã C, </w:t>
+        <w:t xml:space="preserve">Mỗi giá trị được theo dõi (result set, kết nối, statement PDO, mảng dòng, chuỗi bí mật) là một đối tượng có trạng thái riêng, theo ý tưởng typestate [30]. Bảng 39 liệt kê 13 trạng thái. Với mã C, </w:t>
       </w:r>
       <w:r>
         <w:rPr>
@@ -3588,7 +3912,7 @@
         <w:rPr>
           <w:noProof/>
         </w:rPr>
-        <w:t>37</w:t>
+        <w:t>39</w:t>
       </w:r>
       <w:r>
         <w:rPr>
@@ -4552,7 +4876,7 @@
           <w:numId w:val="0"/>
         </w:numPr>
       </w:pPr>
-      <w:bookmarkStart w:id="17" w:name="_Toc243599943"/>
+      <w:bookmarkStart w:id="17" w:name="_Toc243827899"/>
       <w:r>
         <w:rPr>
           <w:lang w:val="vi-VN"/>
@@ -4719,7 +5043,7 @@
         <w:pStyle w:val="csparagraph"/>
       </w:pPr>
       <w:r>
-        <w:t>Bảng 38 cho biết mỗi loại mệnh đề sinh ra sự kiện nào. Bảng chuyển trạng thái có 36 dòng dạng (trạng thái, sự kiện) → (trạng thái mới, vi phạm); Hình 17 vẽ các chuyển chính, còn bảng đầy đủ nằm ở sheet BoNhoTrangThai của tệp Excel [18].</w:t>
+        <w:t>Bảng 40 cho biết mỗi loại mệnh đề sinh ra sự kiện nào. Bảng chuyển trạng thái có 36 dòng dạng (trạng thái, sự kiện) → (trạng thái mới, vi phạm); Hình 17 vẽ các chuyển chính, còn bảng đầy đủ nằm ở sheet BoNhoTrangThai của tệp Excel [18].</w:t>
       </w:r>
     </w:p>
     <w:p>
@@ -4738,7 +5062,7 @@
         <w:rPr>
           <w:noProof/>
         </w:rPr>
-        <w:t>38</w:t>
+        <w:t>40</w:t>
       </w:r>
       <w:r>
         <w:rPr>
@@ -5861,7 +6185,7 @@
       </w:r>
       <w:r>
         <w:lastRenderedPageBreak/>
-        <w:t xml:space="preserve">2 lần. Tổng cộng bộ phân tích ghi 1.127 bước chuyển, trong đó 710 bước thuộc baseline. Bảng 39 là vết chuyển trạng thái của </w:t>
+        <w:t xml:space="preserve">2 lần. Tổng cộng bộ phân tích ghi 1.127 bước chuyển, trong đó 710 bước thuộc baseline. Bảng 41 là vết chuyển trạng thái của </w:t>
       </w:r>
       <w:r>
         <w:rPr>
@@ -5891,7 +6215,7 @@
         <w:rPr>
           <w:noProof/>
         </w:rPr>
-        <w:t>39</w:t>
+        <w:t>41</w:t>
       </w:r>
       <w:r>
         <w:rPr>
@@ -6713,7 +7037,7 @@
           <w:numId w:val="0"/>
         </w:numPr>
       </w:pPr>
-      <w:bookmarkStart w:id="21" w:name="_Toc243599944"/>
+      <w:bookmarkStart w:id="21" w:name="_Toc243827900"/>
       <w:r>
         <w:rPr>
           <w:lang w:val="vi-VN"/>
@@ -6727,7 +7051,7 @@
         <w:pStyle w:val="csparagraph"/>
       </w:pPr>
       <w:r>
-        <w:t xml:space="preserve">Bảng 40 liệt kê các thành phần. Các case PHP và C theo cùng quy ước với phần mã sinh: tệp </w:t>
+        <w:t xml:space="preserve">Bảng 42 liệt kê các thành phần. Các case PHP và C theo cùng quy ước với phần mã sinh: tệp </w:t>
       </w:r>
       <w:r>
         <w:rPr>
@@ -6768,7 +7092,7 @@
         <w:rPr>
           <w:noProof/>
         </w:rPr>
-        <w:t>40</w:t>
+        <w:t>42</w:t>
       </w:r>
       <w:r>
         <w:rPr>
@@ -7772,7 +8096,7 @@
         <w:t>Kích thước bộ đệm C</w:t>
       </w:r>
       <w:r>
-        <w:t xml:space="preserve"> (Bảng 41). Mô hình </w:t>
+        <w:t xml:space="preserve"> (Bảng 43). Mô hình </w:t>
       </w:r>
       <w:r>
         <w:rPr>
@@ -7824,7 +8148,7 @@
         <w:rPr>
           <w:noProof/>
         </w:rPr>
-        <w:t>41</w:t>
+        <w:t>43</w:t>
       </w:r>
       <w:r>
         <w:rPr>
@@ -8595,7 +8919,7 @@
           <w:numId w:val="0"/>
         </w:numPr>
       </w:pPr>
-      <w:bookmarkStart w:id="24" w:name="_Toc243599945"/>
+      <w:bookmarkStart w:id="24" w:name="_Toc243827901"/>
       <w:r>
         <w:rPr>
           <w:lang w:val="vi-VN"/>
@@ -8609,7 +8933,7 @@
         <w:pStyle w:val="csparagraph"/>
       </w:pPr>
       <w:r>
-        <w:t>Bảng 42 tổng hợp vi phạm do bộ phân tích trạng thái ghi nhận; 27 trong 66 tệp baseline có ít nhất một vi phạm.</w:t>
+        <w:t>Bảng 44 tổng hợp vi phạm do bộ phân tích trạng thái ghi nhận; 27 trong 66 tệp baseline có ít nhất một vi phạm.</w:t>
       </w:r>
     </w:p>
     <w:p>
@@ -8628,7 +8952,7 @@
         <w:rPr>
           <w:noProof/>
         </w:rPr>
-        <w:t>42</w:t>
+        <w:t>44</w:t>
       </w:r>
       <w:r>
         <w:rPr>
@@ -9727,7 +10051,7 @@
         <w:pStyle w:val="csparagraph"/>
       </w:pPr>
       <w:r>
-        <w:t>Từ Bảng 42 rút ra ba nhận xét:</w:t>
+        <w:t>Từ Bảng 44 rút ra ba nhận xét:</w:t>
       </w:r>
     </w:p>
     <w:p>
@@ -9885,7 +10209,7 @@
       </w:pPr>
       <w:r>
         <w:lastRenderedPageBreak/>
-        <w:t xml:space="preserve">Semgrep 1.176.1 [7] chạy 7 luật PHP và 4 luật C do nhóm viết để đối chiếu chéo (Bảng 43). Luật Semgrep không biết schema và refcount nên kết quả chỉ là ứng viên. Trên các case </w:t>
+        <w:t xml:space="preserve">Semgrep 1.176.1 [7] chạy 7 luật PHP và 4 luật C do nhóm viết để đối chiếu chéo (Bảng 45). Luật Semgrep không biết schema và refcount nên kết quả chỉ là ứng viên. Trên các case </w:t>
       </w:r>
       <w:r>
         <w:rPr>
@@ -9948,7 +10272,7 @@
         <w:rPr>
           <w:noProof/>
         </w:rPr>
-        <w:t>43</w:t>
+        <w:t>45</w:t>
       </w:r>
       <w:r>
         <w:rPr>
@@ -10464,7 +10788,7 @@
         <w:t>_v1</w:t>
       </w:r>
       <w:r>
-        <w:t xml:space="preserve">. Bảng 44 là kết quả trên các tệp </w:t>
+        <w:t xml:space="preserve">. Bảng 46 là kết quả trên các tệp </w:t>
       </w:r>
       <w:r>
         <w:rPr>
@@ -10516,7 +10840,7 @@
         <w:rPr>
           <w:noProof/>
         </w:rPr>
-        <w:t>44</w:t>
+        <w:t>46</w:t>
       </w:r>
       <w:r>
         <w:rPr>
@@ -11366,7 +11690,7 @@
           <w:numId w:val="0"/>
         </w:numPr>
       </w:pPr>
-      <w:bookmarkStart w:id="28" w:name="_Toc243599946"/>
+      <w:bookmarkStart w:id="28" w:name="_Toc243827902"/>
       <w:r>
         <w:rPr>
           <w:lang w:val="vi-VN"/>
@@ -11380,7 +11704,7 @@
         <w:pStyle w:val="csparagraph"/>
       </w:pPr>
       <w:r>
-        <w:t>CWE được tra trên API của MITRE ngày 21/10/2026 [2]. MITRE đánh dấu CWE-690 và CWE-400 là “Discouraged” khi ánh xạ lỗ hổng, nên nhóm dùng CWE-252 và CWE-770 làm CWE chính và chỉ ghi hai CWE kia kèm theo. CVE được tra trên NVD [36]. Mỗi CVE trong Bảng 45 chỉ là ví dụ cùng lớp CWE trên sản phẩm khác; không có CVE nào được gán cho mã của thư viện này.</w:t>
+        <w:t>CWE được tra trên API của MITRE ngày 21/10/2026 [2]. MITRE đánh dấu CWE-690 và CWE-400 là “Discouraged” khi ánh xạ lỗ hổng, nên nhóm dùng CWE-252 và CWE-770 làm CWE chính và chỉ ghi hai CWE kia kèm theo. CVE được tra trên NVD [36]. Mỗi CVE trong Bảng 47 chỉ là ví dụ cùng lớp CWE trên sản phẩm khác; không có CVE nào được gán cho mã của thư viện này.</w:t>
       </w:r>
     </w:p>
     <w:p>
@@ -11399,7 +11723,7 @@
         <w:rPr>
           <w:noProof/>
         </w:rPr>
-        <w:t>45</w:t>
+        <w:t>47</w:t>
       </w:r>
       <w:r>
         <w:rPr>
@@ -12368,15 +12692,20 @@
           <w:numId w:val="0"/>
         </w:numPr>
       </w:pPr>
-      <w:bookmarkStart w:id="30" w:name="_Toc243599947"/>
-      <w:r>
-        <w:rPr>
-          <w:lang w:val="vi-VN"/>
-        </w:rPr>
+      <w:bookmarkStart w:id="30" w:name="_Toc243827903"/>
+      <w:r>
         <w:lastRenderedPageBreak/>
-        <w:t>7. Kết luận, tài liệu tham khảo và phụ lục</w:t>
+        <w:t>10. Phản biện &amp; Bài học</w:t>
       </w:r>
       <w:bookmarkEnd w:id="30"/>
+    </w:p>
+    <w:p>
+      <w:pPr>
+        <w:pStyle w:val="csparagraph"/>
+      </w:pPr>
+      <w:r>
+        <w:t>Chương này trả lời ba câu hỏi phản biện của hướng dẫn báo cáo, gắn với chính hệ thống và quá trình làm của nhóm.</w:t>
+      </w:r>
     </w:p>
     <w:p>
       <w:pPr>
@@ -12386,508 +12715,123 @@
           <w:numId w:val="0"/>
         </w:numPr>
       </w:pPr>
-      <w:bookmarkStart w:id="31" w:name="_Toc243599948"/>
-      <w:r>
-        <w:rPr>
-          <w:lang w:val="vi-VN"/>
-        </w:rPr>
-        <w:t>7.2 Tài liệu tham khảo</w:t>
+      <w:bookmarkStart w:id="31" w:name="_Toc243827904"/>
+      <w:r>
+        <w:t>10.1 Nếu làm lại từ đầu, nhóm sẽ thiết kế khác ở đâu?</w:t>
       </w:r>
       <w:bookmarkEnd w:id="31"/>
     </w:p>
     <w:p>
       <w:pPr>
         <w:pStyle w:val="csparagraph"/>
-      </w:pPr>
-      <w:r>
-        <w:t>[1] OWASP Foundation, "OWASP Top 10:2021," 2021. [Online]. Available: https://owasp.org/Top10/</w:t>
+        <w:numPr>
+          <w:ilvl w:val="0"/>
+          <w:numId w:val="51"/>
+        </w:numPr>
+        <w:spacing w:after="60"/>
+      </w:pPr>
+      <w:r>
+        <w:rPr>
+          <w:b/>
+          <w:bCs/>
+        </w:rPr>
+        <w:t>Một cửa cho dữ liệu.</w:t>
+      </w:r>
+      <w:r>
+        <w:t xml:space="preserve"> Nhóm sẽ bắt đầu bằng một hàm truy cập dữ liệu duy nhất kiểu </w:t>
+      </w:r>
+      <w:r>
+        <w:rPr>
+          <w:rFonts w:ascii="Consolas" w:hAnsi="Consolas" w:cs="Consolas"/>
+          <w:sz w:val="24"/>
+          <w:szCs w:val="24"/>
+        </w:rPr>
+        <w:t>db_query()</w:t>
+      </w:r>
+      <w:r>
+        <w:t xml:space="preserve"> và quy ước "câu SQL chỉ là chuỗi hằng". 54 điểm gọi truy vấn và 52 điểm in lỗi rải rác trong 37 tệp là nguồn chung của FIND-03, FIND-09 và FIND-10; khi vá, nhóm phải sửa 48 tệp cùng lúc.</w:t>
       </w:r>
     </w:p>
     <w:p>
       <w:pPr>
         <w:pStyle w:val="csparagraph"/>
-      </w:pPr>
-      <w:r>
-        <w:t>[2] The MITRE Corporation, "CWE – Common Weakness Enumeration." [Online]. Available: https://cwe.mitre.org/</w:t>
+        <w:numPr>
+          <w:ilvl w:val="0"/>
+          <w:numId w:val="51"/>
+        </w:numPr>
+        <w:spacing w:after="60"/>
+      </w:pPr>
+      <w:r>
+        <w:rPr>
+          <w:b/>
+          <w:bCs/>
+        </w:rPr>
+        <w:t>Kiểm soát đặt ở thao tác, không ở trang.</w:t>
+      </w:r>
+      <w:r>
+        <w:t xml:space="preserve"> Mọi endpoint ghi dữ liệu nên đi qua một guard bắt buộc ngay từ đầu, giống </w:t>
+      </w:r>
+      <w:r>
+        <w:rPr>
+          <w:rFonts w:ascii="Consolas" w:hAnsi="Consolas" w:cs="Consolas"/>
+          <w:sz w:val="24"/>
+          <w:szCs w:val="24"/>
+        </w:rPr>
+        <w:t>auth_guard.php</w:t>
+      </w:r>
+      <w:r>
+        <w:t>. Thiết kế "trang có guard, handler thì không" chính là nguyên nhân của hai lỗi Critical và High (FIND-02, FIND-06).</w:t>
       </w:r>
     </w:p>
     <w:p>
       <w:pPr>
         <w:pStyle w:val="csparagraph"/>
-      </w:pPr>
-      <w:r>
-        <w:t>[3] V. Shahdeo, "Library-Management-System," GitHub repository, commit 082d6fb9bdd7846b57033513791ba5b6d2095c11, 2020. [Online]. Available: https://github.com/vinitshahdeo/Library-Management-System</w:t>
+        <w:numPr>
+          <w:ilvl w:val="0"/>
+          <w:numId w:val="51"/>
+        </w:numPr>
+        <w:spacing w:after="60"/>
+      </w:pPr>
+      <w:r>
+        <w:rPr>
+          <w:b/>
+          <w:bCs/>
+        </w:rPr>
+        <w:t>Mã hóa đầu ra là mặc định.</w:t>
+      </w:r>
+      <w:r>
+        <w:t xml:space="preserve"> Một hàm </w:t>
+      </w:r>
+      <w:r>
+        <w:rPr>
+          <w:rFonts w:ascii="Consolas" w:hAnsi="Consolas" w:cs="Consolas"/>
+          <w:sz w:val="24"/>
+          <w:szCs w:val="24"/>
+        </w:rPr>
+        <w:t>e()</w:t>
+      </w:r>
+      <w:r>
+        <w:t xml:space="preserve"> dùng cho mọi lệnh echo, kèm một rule kiểm tra trong CI, rẻ hơn nhiều so với việc rà 240 lệnh echo sau này.</w:t>
       </w:r>
     </w:p>
     <w:p>
       <w:pPr>
         <w:pStyle w:val="csparagraph"/>
-      </w:pPr>
-      <w:r>
-        <w:t xml:space="preserve">[4] The PHP Group, "Removed extensions and SAPIs," in </w:t>
-      </w:r>
-      <w:r>
-        <w:rPr>
-          <w:i/>
-          <w:iCs/>
-        </w:rPr>
-        <w:t>PHP Manual – Migrating from PHP 5.6.x to PHP 7.0.x</w:t>
-      </w:r>
-      <w:r>
-        <w:t>. [Online]. Available: https://www.php.net/manual/en/migration70.removed-exts-sapis.php</w:t>
-      </w:r>
-    </w:p>
-    <w:p>
-      <w:pPr>
-        <w:pStyle w:val="csparagraph"/>
-      </w:pPr>
-      <w:r>
-        <w:t xml:space="preserve">[5] OWASP Foundation, </w:t>
-      </w:r>
-      <w:r>
-        <w:rPr>
-          <w:i/>
-          <w:iCs/>
-        </w:rPr>
-        <w:t>OWASP Web Security Testing Guide</w:t>
-      </w:r>
-      <w:r>
-        <w:t>, v4.2, 2020. [Online]. Available: https://owasp.org/www-project-web-security-testing-guide/</w:t>
-      </w:r>
-    </w:p>
-    <w:p>
-      <w:pPr>
-        <w:pStyle w:val="csparagraph"/>
-      </w:pPr>
-      <w:r>
-        <w:t xml:space="preserve">[6] B. Chess and J. West, </w:t>
-      </w:r>
-      <w:r>
-        <w:rPr>
-          <w:i/>
-          <w:iCs/>
-        </w:rPr>
-        <w:t>Secure Programming with Static Analysis</w:t>
-      </w:r>
-      <w:r>
-        <w:t>. Upper Saddle River, NJ, USA: Addison-Wesley, 2007.</w:t>
-      </w:r>
-    </w:p>
-    <w:p>
-      <w:pPr>
-        <w:pStyle w:val="csparagraph"/>
-      </w:pPr>
-      <w:r>
-        <w:t>[7] Semgrep, Inc., "Semgrep documentation." [Online]. Available: https://semgrep.dev/docs/</w:t>
-      </w:r>
-    </w:p>
-    <w:p>
-      <w:pPr>
-        <w:pStyle w:val="csparagraph"/>
-      </w:pPr>
-      <w:r>
-        <w:t>[8] PHPStan, "PHPStan – User Guide." [Online]. Available: https://phpstan.org/user-guide/getting-started</w:t>
-      </w:r>
-    </w:p>
-    <w:p>
-      <w:pPr>
-        <w:pStyle w:val="csparagraph"/>
-      </w:pPr>
-      <w:r>
-        <w:t>[9] K. Scarfone, M. Souppaya, A. Cody, and A. Orebaugh, "Technical guide to information security testing and assessment," NIST, Gaithersburg, MD, USA, SP 800-115, Sep. 2008.</w:t>
-      </w:r>
-    </w:p>
-    <w:p>
-      <w:pPr>
-        <w:pStyle w:val="csparagraph"/>
-      </w:pPr>
-      <w:r>
-        <w:t xml:space="preserve">[10] </w:t>
-      </w:r>
-      <w:r>
-        <w:rPr>
-          <w:i/>
-          <w:iCs/>
-        </w:rPr>
-        <w:t>Software and Systems Engineering — Software Testing — Part 4: Test Techniques</w:t>
-      </w:r>
-      <w:r>
-        <w:t>, ISO/IEC/IEEE 29119-4:2021, 2021.</w:t>
-      </w:r>
-    </w:p>
-    <w:p>
-      <w:pPr>
-        <w:pStyle w:val="csparagraph"/>
-      </w:pPr>
-      <w:r>
-        <w:t xml:space="preserve">[11] OWASP Foundation, </w:t>
-      </w:r>
-      <w:r>
-        <w:rPr>
-          <w:i/>
-          <w:iCs/>
-        </w:rPr>
-        <w:t>Application Security Verification Standard</w:t>
-      </w:r>
-      <w:r>
-        <w:t>, v4.0.3, 2021. [Online]. Available: https://owasp.org/www-project-application-security-verification-standard/</w:t>
-      </w:r>
-    </w:p>
-    <w:p>
-      <w:pPr>
-        <w:pStyle w:val="csparagraph"/>
-      </w:pPr>
-      <w:r>
-        <w:t xml:space="preserve">[12] </w:t>
-      </w:r>
-      <w:r>
-        <w:rPr>
-          <w:i/>
-          <w:iCs/>
-        </w:rPr>
-        <w:t>Systems and Software Engineering — Life Cycle Processes — Requirements Engineering</w:t>
-      </w:r>
-      <w:r>
-        <w:t>, ISO/IEC/IEEE 29148:2018, 2018.</w:t>
-      </w:r>
-    </w:p>
-    <w:p>
-      <w:pPr>
-        <w:pStyle w:val="csparagraph"/>
-      </w:pPr>
-      <w:r>
-        <w:t xml:space="preserve">[13] G. J. Myers, C. Sandler, and T. Badgett, </w:t>
-      </w:r>
-      <w:r>
-        <w:rPr>
-          <w:i/>
-          <w:iCs/>
-        </w:rPr>
-        <w:t>The Art of Software Testing</w:t>
-      </w:r>
-      <w:r>
-        <w:t>, 3rd ed. Hoboken, NJ, USA: Wiley, 2011.</w:t>
-      </w:r>
-    </w:p>
-    <w:p>
-      <w:pPr>
-        <w:pStyle w:val="csparagraph"/>
-      </w:pPr>
-      <w:r>
-        <w:lastRenderedPageBreak/>
-        <w:t xml:space="preserve">[14] </w:t>
-      </w:r>
-      <w:r>
-        <w:rPr>
-          <w:i/>
-          <w:iCs/>
-        </w:rPr>
-        <w:t>Software and Systems Engineering — Software Testing — Part 3: Test Documentation</w:t>
-      </w:r>
-      <w:r>
-        <w:t>, ISO/IEC/IEEE 29119-3:2021, 2021.</w:t>
-      </w:r>
-    </w:p>
-    <w:p>
-      <w:pPr>
-        <w:pStyle w:val="csparagraph"/>
-      </w:pPr>
-      <w:r>
-        <w:t xml:space="preserve">[15] </w:t>
-      </w:r>
-      <w:r>
-        <w:rPr>
-          <w:i/>
-          <w:iCs/>
-        </w:rPr>
-        <w:t>IEEE Standard for Software and System Test Documentation</w:t>
-      </w:r>
-      <w:r>
-        <w:t>, IEEE Std 829-2008, 2008.</w:t>
-      </w:r>
-    </w:p>
-    <w:p>
-      <w:pPr>
-        <w:pStyle w:val="csparagraph"/>
-      </w:pPr>
-      <w:r>
-        <w:t>[16] Nhóm 13, "atpm – Hồ sơ nghiên cứu kiểm thử tĩnh phân hệ thủ thư (study/scope.md, baseline.md)," GitHub repository. [Online]. Available: https://github.com/ndviet0303/atpm</w:t>
-      </w:r>
-    </w:p>
-    <w:p>
-      <w:pPr>
-        <w:pStyle w:val="csparagraph"/>
-      </w:pPr>
-      <w:r>
-        <w:t xml:space="preserve">[17] Oracle Corporation, "The MyISAM storage engine," in </w:t>
-      </w:r>
-      <w:r>
-        <w:rPr>
-          <w:i/>
-          <w:iCs/>
-        </w:rPr>
-        <w:t>MySQL 5.7 Reference Manual</w:t>
-      </w:r>
-      <w:r>
-        <w:t>. [Online]. Available: https://dev.mysql.com/doc/refman/5.7/en/myisam-storage-engine.html</w:t>
-      </w:r>
-    </w:p>
-    <w:p>
-      <w:pPr>
-        <w:pStyle w:val="csparagraph"/>
-      </w:pPr>
-      <w:r>
-        <w:t>[18] Nhóm 13, "Báo cáo bài tập lớn kiểm thử tĩnh mã nguồn hệ thống quản lý thư viện" và "Đặc tả và test case" (tệp PDF, Excel), Trường Đại học Phenikaa, 10/2026.</w:t>
-      </w:r>
-    </w:p>
-    <w:p>
-      <w:pPr>
-        <w:pStyle w:val="csparagraph"/>
-      </w:pPr>
-      <w:r>
-        <w:t xml:space="preserve">[19] The PHP Group, "header," in </w:t>
-      </w:r>
-      <w:r>
-        <w:rPr>
-          <w:i/>
-          <w:iCs/>
-        </w:rPr>
-        <w:t>PHP Manual</w:t>
-      </w:r>
-      <w:r>
-        <w:t>. [Online]. Available: https://www.php.net/manual/en/function.header.php</w:t>
-      </w:r>
-    </w:p>
-    <w:p>
-      <w:pPr>
-        <w:pStyle w:val="csparagraph"/>
-      </w:pPr>
-      <w:r>
-        <w:t xml:space="preserve">[20] Oracle Corporation, "Server SQL modes," in </w:t>
-      </w:r>
-      <w:r>
-        <w:rPr>
-          <w:i/>
-          <w:iCs/>
-        </w:rPr>
-        <w:t>MySQL 5.7 Reference Manual</w:t>
-      </w:r>
-      <w:r>
-        <w:t>. [Online]. Available: https://dev.mysql.com/doc/refman/5.7/en/sql-mode.html</w:t>
-      </w:r>
-    </w:p>
-    <w:p>
-      <w:pPr>
-        <w:pStyle w:val="csparagraph"/>
-      </w:pPr>
-      <w:r>
-        <w:t xml:space="preserve">[21] M. Davis, G. Logemann, and D. Loveland, "A machine program for theorem-proving," </w:t>
-      </w:r>
-      <w:r>
-        <w:rPr>
-          <w:i/>
-          <w:iCs/>
-        </w:rPr>
-        <w:t>Communications of the ACM</w:t>
-      </w:r>
-      <w:r>
-        <w:t>, vol. 5, no. 7, pp. 394–397, 1962.</w:t>
-      </w:r>
-    </w:p>
-    <w:p>
-      <w:pPr>
-        <w:pStyle w:val="csparagraph"/>
-      </w:pPr>
-      <w:r>
-        <w:t xml:space="preserve">[22] L. de Moura and N. Bjørner, "Z3: An efficient SMT solver," in </w:t>
-      </w:r>
-      <w:r>
-        <w:rPr>
-          <w:i/>
-          <w:iCs/>
-        </w:rPr>
-        <w:t>Proc. Tools and Algorithms for the Construction and Analysis of Systems (TACAS 2008)</w:t>
-      </w:r>
-      <w:r>
-        <w:t>, LNCS, vol. 4963. Berlin, Germany: Springer, 2008, pp. 337–340.</w:t>
-      </w:r>
-    </w:p>
-    <w:p>
-      <w:pPr>
-        <w:pStyle w:val="csparagraph"/>
-      </w:pPr>
-      <w:r>
-        <w:t xml:space="preserve">[23] OWASP Foundation, "SQL Injection Prevention Cheat Sheet," </w:t>
-      </w:r>
-      <w:r>
-        <w:rPr>
-          <w:i/>
-          <w:iCs/>
-        </w:rPr>
-        <w:t>OWASP Cheat Sheet Series</w:t>
-      </w:r>
-      <w:r>
-        <w:t>. [Online]. Available: https://cheatsheetseries.owasp.org/cheatsheets/SQL_Injection_Prevention_Cheat_Sheet.html</w:t>
-      </w:r>
-    </w:p>
-    <w:p>
-      <w:pPr>
-        <w:pStyle w:val="csparagraph"/>
-      </w:pPr>
-      <w:r>
-        <w:t xml:space="preserve">[24] OWASP Foundation, "Cross Site Scripting Prevention Cheat Sheet," </w:t>
-      </w:r>
-      <w:r>
-        <w:rPr>
-          <w:i/>
-          <w:iCs/>
-        </w:rPr>
-        <w:t>OWASP Cheat Sheet Series</w:t>
-      </w:r>
-      <w:r>
-        <w:t>. [Online]. Available: https://cheatsheetseries.owasp.org/cheatsheets/Cross_Site_Scripting_Prevention_Cheat_Sheet.html</w:t>
-      </w:r>
-    </w:p>
-    <w:p>
-      <w:pPr>
-        <w:pStyle w:val="csparagraph"/>
-      </w:pPr>
-      <w:r>
-        <w:t xml:space="preserve">[25] OWASP Foundation, "Cross-Site Request Forgery Prevention Cheat Sheet," </w:t>
-      </w:r>
-      <w:r>
-        <w:rPr>
-          <w:i/>
-          <w:iCs/>
-        </w:rPr>
-        <w:t>OWASP Cheat Sheet Series</w:t>
-      </w:r>
-      <w:r>
-        <w:t>. [Online]. Available: https://cheatsheetseries.owasp.org/cheatsheets/Cross-Site_Request_Forgery_Prevention_Cheat_Sheet.html</w:t>
-      </w:r>
-    </w:p>
-    <w:p>
-      <w:pPr>
-        <w:pStyle w:val="csparagraph"/>
-      </w:pPr>
-      <w:r>
-        <w:lastRenderedPageBreak/>
-        <w:t xml:space="preserve">[26] C. Wohlin, P. Runeson, M. Höst, M. C. Ohlsson, B. Regnell, and A. Wesslén, </w:t>
-      </w:r>
-      <w:r>
-        <w:rPr>
-          <w:i/>
-          <w:iCs/>
-        </w:rPr>
-        <w:t>Experimentation in Software Engineering</w:t>
-      </w:r>
-      <w:r>
-        <w:t>. Berlin, Germany: Springer, 2012.</w:t>
-      </w:r>
-    </w:p>
-    <w:p>
-      <w:pPr>
-        <w:pStyle w:val="csparagraph"/>
-      </w:pPr>
-      <w:r>
-        <w:t>[27] Association for Computing Machinery, "ACM Code of Ethics and Professional Conduct," 2018. [Online]. Available: https://www.acm.org/code-of-ethics</w:t>
-      </w:r>
-    </w:p>
-    <w:p>
-      <w:pPr>
-        <w:pStyle w:val="csparagraph"/>
-      </w:pPr>
-      <w:r>
-        <w:t xml:space="preserve">[28] OWASP Foundation, "Password Storage Cheat Sheet," </w:t>
-      </w:r>
-      <w:r>
-        <w:rPr>
-          <w:i/>
-          <w:iCs/>
-        </w:rPr>
-        <w:t>OWASP Cheat Sheet Series</w:t>
-      </w:r>
-      <w:r>
-        <w:t>. [Online]. Available: https://cheatsheetseries.owasp.org/cheatsheets/Password_Storage_Cheat_Sheet.html</w:t>
-      </w:r>
-    </w:p>
-    <w:p>
-      <w:pPr>
-        <w:pStyle w:val="csparagraph"/>
-      </w:pPr>
-      <w:r>
-        <w:t xml:space="preserve">[29] The PHP Group, "Prepared statements and stored procedures," in </w:t>
-      </w:r>
-      <w:r>
-        <w:rPr>
-          <w:i/>
-          <w:iCs/>
-        </w:rPr>
-        <w:t>PHP Manual – PHP Data Objects</w:t>
-      </w:r>
-      <w:r>
-        <w:t>. [Online]. Available: https://www.php.net/manual/en/pdo.prepared-statements.php</w:t>
-      </w:r>
-    </w:p>
-    <w:p>
-      <w:pPr>
-        <w:pStyle w:val="csparagraph"/>
-      </w:pPr>
-      <w:r>
-        <w:t>[30] R. E. Strom and S. Yemini, "Typestate: A programming language concept for enhancing software reliability," IEEE Transactions on Software Engineering, vol. SE-12, no. 1, pp. 157–171, 1986.</w:t>
-      </w:r>
-    </w:p>
-    <w:p>
-      <w:pPr>
-        <w:pStyle w:val="csparagraph"/>
-      </w:pPr>
-      <w:r>
-        <w:t>[31] The PHP Group, "Memory management," in PHP Manual – Mysqlnd. [Online]. Available: https://www.php.net/manual/en/mysqlnd.memory.php</w:t>
-      </w:r>
-    </w:p>
-    <w:p>
-      <w:pPr>
-        <w:pStyle w:val="csparagraph"/>
-      </w:pPr>
-      <w:r>
-        <w:t>[32] The PHP Group, "ext/sodium/libsodium.c," php-src, GitHub repository. [Online]. Available: https://github.com/php/php-src/blob/master/ext/sodium/libsodium.c</w:t>
-      </w:r>
-    </w:p>
-    <w:p>
-      <w:pPr>
-        <w:pStyle w:val="csparagraph"/>
-      </w:pPr>
-      <w:r>
-        <w:t>[33] A. Biere, A. Cimatti, E. Clarke, and Y. Zhu, "Symbolic model checking without BDDs," in Proc. Tools and Algorithms for the Construction and Analysis of Systems (TACAS 1999), LNCS, vol. 1579. Berlin, Germany: Springer, 1999, pp. 193–207.</w:t>
-      </w:r>
-    </w:p>
-    <w:p>
-      <w:pPr>
-        <w:pStyle w:val="csparagraph"/>
-      </w:pPr>
-      <w:r>
-        <w:t>[34] Free Software Foundation, "Options that control static analysis," in Using the GNU Compiler Collection. [Online]. Available: https://gcc.gnu.org/onlinedocs/gcc/Static-Analyzer-Options.html</w:t>
-      </w:r>
-    </w:p>
-    <w:p>
-      <w:pPr>
-        <w:pStyle w:val="csparagraph"/>
-      </w:pPr>
-      <w:r>
-        <w:t>[35] LLVM Project, "Clang Static Analyzer." [Online]. Available: https://clang-analyzer.llvm.org/</w:t>
-      </w:r>
-    </w:p>
-    <w:p>
-      <w:pPr>
-        <w:pStyle w:val="csparagraph"/>
-      </w:pPr>
-      <w:r>
-        <w:t>[36] National Institute of Standards and Technology, "National Vulnerability Database." [Online]. Available: https://nvd.nist.gov/</w:t>
-      </w:r>
-    </w:p>
-    <w:p>
-      <w:r>
-        <w:br w:type="page"/>
+        <w:numPr>
+          <w:ilvl w:val="0"/>
+          <w:numId w:val="51"/>
+        </w:numPr>
+        <w:spacing w:after="60"/>
+      </w:pPr>
+      <w:r>
+        <w:rPr>
+          <w:b/>
+          <w:bCs/>
+        </w:rPr>
+        <w:t>Về quy trình:</w:t>
+      </w:r>
+      <w:r>
+        <w:t xml:space="preserve"> viết yêu cầu an toàn (NFR) và test case hồi quy trước khi vá, đồng thời vá sớm theo từng đợt thay vì chỉ vá sau khi đã hoàn tất toàn bộ phần đánh giá.</w:t>
       </w:r>
     </w:p>
     <w:p>
@@ -12898,15 +12842,753 @@
           <w:numId w:val="0"/>
         </w:numPr>
       </w:pPr>
-      <w:bookmarkStart w:id="32" w:name="_Toc243599949"/>
+      <w:bookmarkStart w:id="32" w:name="_Toc243827905"/>
+      <w:r>
+        <w:t>10.2 Lỗ hổng nào nhóm nghi còn tồn tại nhưng chưa xác nhận?</w:t>
+      </w:r>
+      <w:bookmarkEnd w:id="32"/>
+    </w:p>
+    <w:p>
+      <w:pPr>
+        <w:pStyle w:val="csparagraph"/>
+        <w:numPr>
+          <w:ilvl w:val="0"/>
+          <w:numId w:val="51"/>
+        </w:numPr>
+        <w:spacing w:after="60"/>
+      </w:pPr>
+      <w:r>
+        <w:rPr>
+          <w:b/>
+          <w:bCs/>
+        </w:rPr>
+        <w:t>Phân quyền ngang hàng (CWE-285, CWE-639).</w:t>
+      </w:r>
+      <w:r>
+        <w:t xml:space="preserve"> Mọi tài khoản thủ thư có toàn quyền, kể cả xóa tài khoản thủ thư khác; chưa có đặc tả vai trò nên nhóm chưa thể kết luận đây là lỗi.</w:t>
+      </w:r>
+    </w:p>
+    <w:p>
+      <w:pPr>
+        <w:pStyle w:val="csparagraph"/>
+        <w:numPr>
+          <w:ilvl w:val="0"/>
+          <w:numId w:val="51"/>
+        </w:numPr>
+        <w:spacing w:after="60"/>
+      </w:pPr>
+      <w:r>
+        <w:rPr>
+          <w:b/>
+          <w:bCs/>
+        </w:rPr>
+        <w:t>Dò mật khẩu (CWE-307).</w:t>
+      </w:r>
+      <w:r>
+        <w:t xml:space="preserve"> Đăng nhập không giới hạn số lần thử; cơ chế ở tầng máy chủ web (nếu có) nằm ngoài mã.</w:t>
+      </w:r>
+    </w:p>
+    <w:p>
+      <w:pPr>
+        <w:pStyle w:val="csparagraph"/>
+        <w:numPr>
+          <w:ilvl w:val="0"/>
+          <w:numId w:val="51"/>
+        </w:numPr>
+        <w:spacing w:after="60"/>
+      </w:pPr>
+      <w:r>
+        <w:rPr>
+          <w:b/>
+          <w:bCs/>
+        </w:rPr>
+        <w:t>Hành vi phụ thuộc cấu hình.</w:t>
+      </w:r>
+      <w:r>
+        <w:t xml:space="preserve"> </w:t>
+      </w:r>
+      <w:r>
+        <w:rPr>
+          <w:rFonts w:ascii="Consolas" w:hAnsi="Consolas" w:cs="Consolas"/>
+          <w:sz w:val="24"/>
+          <w:szCs w:val="24"/>
+        </w:rPr>
+        <w:t>index.php</w:t>
+      </w:r>
+      <w:r>
+        <w:t xml:space="preserve"> và các trang gọi </w:t>
+      </w:r>
+      <w:r>
+        <w:rPr>
+          <w:rFonts w:ascii="Consolas" w:hAnsi="Consolas" w:cs="Consolas"/>
+          <w:sz w:val="24"/>
+          <w:szCs w:val="24"/>
+        </w:rPr>
+        <w:t>session_start()</w:t>
+      </w:r>
+      <w:r>
+        <w:t xml:space="preserve"> sau khi đã xuất HTML; nếu </w:t>
+      </w:r>
+      <w:r>
+        <w:rPr>
+          <w:rFonts w:ascii="Consolas" w:hAnsi="Consolas" w:cs="Consolas"/>
+          <w:sz w:val="24"/>
+          <w:szCs w:val="24"/>
+        </w:rPr>
+        <w:t>output_buffering</w:t>
+      </w:r>
+      <w:r>
+        <w:t xml:space="preserve"> tắt, cờ cookie phiên của v1 có thể không được áp dụng. Chỉ kiểm thử động mới xác nhận được.</w:t>
+      </w:r>
+    </w:p>
+    <w:p>
+      <w:pPr>
+        <w:pStyle w:val="csparagraph"/>
+        <w:numPr>
+          <w:ilvl w:val="0"/>
+          <w:numId w:val="51"/>
+        </w:numPr>
+        <w:spacing w:after="60"/>
+      </w:pPr>
+      <w:r>
+        <w:rPr>
+          <w:b/>
+          <w:bCs/>
+        </w:rPr>
+        <w:t>Lỗi do chính bản vá.</w:t>
+      </w:r>
+      <w:r>
+        <w:t xml:space="preserve"> v1 mới được kiểm chứng tĩnh. Các thay đổi kiểu dữ liệu (ví dụ bind </w:t>
+      </w:r>
+      <w:r>
+        <w:rPr>
+          <w:rFonts w:ascii="Consolas" w:hAnsi="Consolas" w:cs="Consolas"/>
+          <w:sz w:val="24"/>
+          <w:szCs w:val="24"/>
+        </w:rPr>
+        <w:t>category_id</w:t>
+      </w:r>
+      <w:r>
+        <w:t xml:space="preserve"> kiểu </w:t>
+      </w:r>
+      <w:r>
+        <w:rPr>
+          <w:rFonts w:ascii="Consolas" w:hAnsi="Consolas" w:cs="Consolas"/>
+          <w:sz w:val="24"/>
+          <w:szCs w:val="24"/>
+        </w:rPr>
+        <w:t>i</w:t>
+      </w:r>
+      <w:r>
+        <w:t xml:space="preserve"> khi form để trống) hoặc việc băm lại mật khẩu cũ chỉ lộ ra khi chạy các test case hồi quy TC-FINDxx-H.</w:t>
+      </w:r>
+    </w:p>
+    <w:p>
+      <w:pPr>
+        <w:pStyle w:val="csparagraph"/>
+        <w:numPr>
+          <w:ilvl w:val="0"/>
+          <w:numId w:val="51"/>
+        </w:numPr>
+        <w:spacing w:after="60"/>
+      </w:pPr>
+      <w:r>
+        <w:rPr>
+          <w:b/>
+          <w:bCs/>
+        </w:rPr>
+        <w:t>Từ chối dịch vụ do truy vấn không cận (CWE-770).</w:t>
+      </w:r>
+      <w:r>
+        <w:t xml:space="preserve"> 25 câu SELECT không LIMIT vẫn còn trong v1; mức độ thật phụ thuộc kích thước dữ liệu.</w:t>
+      </w:r>
+    </w:p>
+    <w:p>
+      <w:pPr>
+        <w:pStyle w:val="Heading2"/>
+        <w:numPr>
+          <w:ilvl w:val="0"/>
+          <w:numId w:val="0"/>
+        </w:numPr>
+      </w:pPr>
+      <w:bookmarkStart w:id="33" w:name="_Toc243827906"/>
+      <w:r>
+        <w:lastRenderedPageBreak/>
+        <w:t>10.3 Bài học lớn nhất về phương pháp</w:t>
+      </w:r>
+      <w:bookmarkEnd w:id="33"/>
+    </w:p>
+    <w:p>
+      <w:pPr>
+        <w:pStyle w:val="csparagraph"/>
+      </w:pPr>
+      <w:r>
+        <w:t xml:space="preserve">Bài học lớn nhất là: con số "0 cảnh báo" chỉ có giá trị khi thước đo không phụ thuộc vào chính thứ bị sửa. Bốn rule tùy biến của nhóm gắn với tên hàm </w:t>
+      </w:r>
+      <w:r>
+        <w:rPr>
+          <w:rFonts w:ascii="Consolas" w:hAnsi="Consolas" w:cs="Consolas"/>
+          <w:sz w:val="24"/>
+          <w:szCs w:val="24"/>
+        </w:rPr>
+        <w:t>mysql_*</w:t>
+      </w:r>
+      <w:r>
+        <w:t>, nên chỉ cần đổi API là chúng về 0, kể cả khi SQL vẫn bị ghép chuỗi. Vì vậy nhóm phải viết thêm rule đo theo ngữ nghĩa (câu SQL dựng từ biến: 35 → 0) và harness cho các lỗi "vắng mặt kiểm soát" mà SAST không thấy.</w:t>
+      </w:r>
+    </w:p>
+    <w:p>
+      <w:pPr>
+        <w:pStyle w:val="csparagraph"/>
+      </w:pPr>
+      <w:r>
+        <w:t>Bài học thứ hai là phải kiểm tra chính quy trình đo. Khi lấy mã từ kho về Windows, Git tự đổi ký tự xuống dòng (LF → CRLF) và chỉ 1/66 tệp v0 còn trùng mã băm. Bước kiểm tra toàn vẹn đã phát hiện ngay, và nhóm lấy lại đúng byte gốc (66/66) trước khi đo. Điều này lặp lại bài học của lần quét 270 cảnh báo: phải đọc mã thoát, trường errors và mã băm, không chỉ đọc con số cuối cùng.</w:t>
+      </w:r>
+    </w:p>
+    <w:p>
+      <w:pPr>
+        <w:pStyle w:val="Heading1"/>
+        <w:pageBreakBefore/>
+        <w:numPr>
+          <w:ilvl w:val="0"/>
+          <w:numId w:val="0"/>
+        </w:numPr>
+      </w:pPr>
+      <w:bookmarkStart w:id="34" w:name="_Toc243827907"/>
       <w:r>
         <w:rPr>
           <w:lang w:val="vi-VN"/>
         </w:rPr>
         <w:lastRenderedPageBreak/>
-        <w:t>7.3 Phụ lục</w:t>
-      </w:r>
-      <w:bookmarkEnd w:id="32"/>
+        <w:t>11. Kết luận, tài liệu tham khảo và phụ lục</w:t>
+      </w:r>
+      <w:bookmarkEnd w:id="34"/>
+    </w:p>
+    <w:p>
+      <w:pPr>
+        <w:pStyle w:val="Heading2"/>
+        <w:numPr>
+          <w:ilvl w:val="0"/>
+          <w:numId w:val="0"/>
+        </w:numPr>
+      </w:pPr>
+      <w:bookmarkStart w:id="35" w:name="_Toc243827908"/>
+      <w:r>
+        <w:rPr>
+          <w:lang w:val="vi-VN"/>
+        </w:rPr>
+        <w:t>11.2 Tài liệu tham khảo</w:t>
+      </w:r>
+      <w:bookmarkEnd w:id="35"/>
+    </w:p>
+    <w:p>
+      <w:pPr>
+        <w:pStyle w:val="csparagraph"/>
+      </w:pPr>
+      <w:r>
+        <w:t>[1] OWASP Foundation, "OWASP Top 10:2021," 2021. [Online]. Available: https://owasp.org/Top10/</w:t>
+      </w:r>
+    </w:p>
+    <w:p>
+      <w:pPr>
+        <w:pStyle w:val="csparagraph"/>
+      </w:pPr>
+      <w:r>
+        <w:t>[2] The MITRE Corporation, "CWE – Common Weakness Enumeration." [Online]. Available: https://cwe.mitre.org/</w:t>
+      </w:r>
+    </w:p>
+    <w:p>
+      <w:pPr>
+        <w:pStyle w:val="csparagraph"/>
+      </w:pPr>
+      <w:r>
+        <w:t>[3] V. Shahdeo, "Library-Management-System," GitHub repository, commit 082d6fb9bdd7846b57033513791ba5b6d2095c11, 2020. [Online]. Available: https://github.com/vinitshahdeo/Library-Management-System</w:t>
+      </w:r>
+    </w:p>
+    <w:p>
+      <w:pPr>
+        <w:pStyle w:val="csparagraph"/>
+      </w:pPr>
+      <w:r>
+        <w:t xml:space="preserve">[4] The PHP Group, "Removed extensions and SAPIs," in </w:t>
+      </w:r>
+      <w:r>
+        <w:rPr>
+          <w:i/>
+          <w:iCs/>
+        </w:rPr>
+        <w:t>PHP Manual – Migrating from PHP 5.6.x to PHP 7.0.x</w:t>
+      </w:r>
+      <w:r>
+        <w:t>. [Online]. Available: https://www.php.net/manual/en/migration70.removed-exts-sapis.php</w:t>
+      </w:r>
+    </w:p>
+    <w:p>
+      <w:pPr>
+        <w:pStyle w:val="csparagraph"/>
+      </w:pPr>
+      <w:r>
+        <w:t xml:space="preserve">[5] OWASP Foundation, </w:t>
+      </w:r>
+      <w:r>
+        <w:rPr>
+          <w:i/>
+          <w:iCs/>
+        </w:rPr>
+        <w:t>OWASP Web Security Testing Guide</w:t>
+      </w:r>
+      <w:r>
+        <w:t>, v4.2, 2020. [Online]. Available: https://owasp.org/www-project-web-security-testing-guide/</w:t>
+      </w:r>
+    </w:p>
+    <w:p>
+      <w:pPr>
+        <w:pStyle w:val="csparagraph"/>
+      </w:pPr>
+      <w:r>
+        <w:t xml:space="preserve">[6] B. Chess and J. West, </w:t>
+      </w:r>
+      <w:r>
+        <w:rPr>
+          <w:i/>
+          <w:iCs/>
+        </w:rPr>
+        <w:t>Secure Programming with Static Analysis</w:t>
+      </w:r>
+      <w:r>
+        <w:t>. Upper Saddle River, NJ, USA: Addison-Wesley, 2007.</w:t>
+      </w:r>
+    </w:p>
+    <w:p>
+      <w:pPr>
+        <w:pStyle w:val="csparagraph"/>
+      </w:pPr>
+      <w:r>
+        <w:t>[7] Semgrep, Inc., "Semgrep documentation." [Online]. Available: https://semgrep.dev/docs/</w:t>
+      </w:r>
+    </w:p>
+    <w:p>
+      <w:pPr>
+        <w:pStyle w:val="csparagraph"/>
+      </w:pPr>
+      <w:r>
+        <w:t>[8] PHPStan, "PHPStan – User Guide." [Online]. Available: https://phpstan.org/user-guide/getting-started</w:t>
+      </w:r>
+    </w:p>
+    <w:p>
+      <w:pPr>
+        <w:pStyle w:val="csparagraph"/>
+      </w:pPr>
+      <w:r>
+        <w:t>[9] K. Scarfone, M. Souppaya, A. Cody, and A. Orebaugh, "Technical guide to information security testing and assessment," NIST, Gaithersburg, MD, USA, SP 800-115, Sep. 2008.</w:t>
+      </w:r>
+    </w:p>
+    <w:p>
+      <w:pPr>
+        <w:pStyle w:val="csparagraph"/>
+      </w:pPr>
+      <w:r>
+        <w:t xml:space="preserve">[10] </w:t>
+      </w:r>
+      <w:r>
+        <w:rPr>
+          <w:i/>
+          <w:iCs/>
+        </w:rPr>
+        <w:t>Software and Systems Engineering — Software Testing — Part 4: Test Techniques</w:t>
+      </w:r>
+      <w:r>
+        <w:t>, ISO/IEC/IEEE 29119-4:2021, 2021.</w:t>
+      </w:r>
+    </w:p>
+    <w:p>
+      <w:pPr>
+        <w:pStyle w:val="csparagraph"/>
+      </w:pPr>
+      <w:r>
+        <w:t xml:space="preserve">[11] OWASP Foundation, </w:t>
+      </w:r>
+      <w:r>
+        <w:rPr>
+          <w:i/>
+          <w:iCs/>
+        </w:rPr>
+        <w:t>Application Security Verification Standard</w:t>
+      </w:r>
+      <w:r>
+        <w:t>, v4.0.3, 2021. [Online]. Available: https://owasp.org/www-project-application-security-verification-standard/</w:t>
+      </w:r>
+    </w:p>
+    <w:p>
+      <w:pPr>
+        <w:pStyle w:val="csparagraph"/>
+      </w:pPr>
+      <w:r>
+        <w:t xml:space="preserve">[12] </w:t>
+      </w:r>
+      <w:r>
+        <w:rPr>
+          <w:i/>
+          <w:iCs/>
+        </w:rPr>
+        <w:t>Systems and Software Engineering — Life Cycle Processes — Requirements Engineering</w:t>
+      </w:r>
+      <w:r>
+        <w:t>, ISO/IEC/IEEE 29148:2018, 2018.</w:t>
+      </w:r>
+    </w:p>
+    <w:p>
+      <w:pPr>
+        <w:pStyle w:val="csparagraph"/>
+      </w:pPr>
+      <w:r>
+        <w:t xml:space="preserve">[13] G. J. Myers, C. Sandler, and T. Badgett, </w:t>
+      </w:r>
+      <w:r>
+        <w:rPr>
+          <w:i/>
+          <w:iCs/>
+        </w:rPr>
+        <w:t>The Art of Software Testing</w:t>
+      </w:r>
+      <w:r>
+        <w:t>, 3rd ed. Hoboken, NJ, USA: Wiley, 2011.</w:t>
+      </w:r>
+    </w:p>
+    <w:p>
+      <w:pPr>
+        <w:pStyle w:val="csparagraph"/>
+      </w:pPr>
+      <w:r>
+        <w:lastRenderedPageBreak/>
+        <w:t xml:space="preserve">[14] </w:t>
+      </w:r>
+      <w:r>
+        <w:rPr>
+          <w:i/>
+          <w:iCs/>
+        </w:rPr>
+        <w:t>Software and Systems Engineering — Software Testing — Part 3: Test Documentation</w:t>
+      </w:r>
+      <w:r>
+        <w:t>, ISO/IEC/IEEE 29119-3:2021, 2021.</w:t>
+      </w:r>
+    </w:p>
+    <w:p>
+      <w:pPr>
+        <w:pStyle w:val="csparagraph"/>
+      </w:pPr>
+      <w:r>
+        <w:t xml:space="preserve">[15] </w:t>
+      </w:r>
+      <w:r>
+        <w:rPr>
+          <w:i/>
+          <w:iCs/>
+        </w:rPr>
+        <w:t>IEEE Standard for Software and System Test Documentation</w:t>
+      </w:r>
+      <w:r>
+        <w:t>, IEEE Std 829-2008, 2008.</w:t>
+      </w:r>
+    </w:p>
+    <w:p>
+      <w:pPr>
+        <w:pStyle w:val="csparagraph"/>
+      </w:pPr>
+      <w:r>
+        <w:t>[16] Nhóm 13, "atpm – Hồ sơ nghiên cứu kiểm thử tĩnh phân hệ thủ thư (study/scope.md, baseline.md)," GitHub repository. [Online]. Available: https://github.com/ndviet0303/atpm</w:t>
+      </w:r>
+    </w:p>
+    <w:p>
+      <w:pPr>
+        <w:pStyle w:val="csparagraph"/>
+      </w:pPr>
+      <w:r>
+        <w:t xml:space="preserve">[17] Oracle Corporation, "The MyISAM storage engine," in </w:t>
+      </w:r>
+      <w:r>
+        <w:rPr>
+          <w:i/>
+          <w:iCs/>
+        </w:rPr>
+        <w:t>MySQL 5.7 Reference Manual</w:t>
+      </w:r>
+      <w:r>
+        <w:t>. [Online]. Available: https://dev.mysql.com/doc/refman/5.7/en/myisam-storage-engine.html</w:t>
+      </w:r>
+    </w:p>
+    <w:p>
+      <w:pPr>
+        <w:pStyle w:val="csparagraph"/>
+      </w:pPr>
+      <w:r>
+        <w:t>[18] Nhóm 13, "Báo cáo bài tập lớn kiểm thử tĩnh mã nguồn hệ thống quản lý thư viện" và "Đặc tả và test case" (tệp PDF, Excel), Trường Đại học Phenikaa, 10/2026.</w:t>
+      </w:r>
+    </w:p>
+    <w:p>
+      <w:pPr>
+        <w:pStyle w:val="csparagraph"/>
+      </w:pPr>
+      <w:r>
+        <w:t xml:space="preserve">[19] The PHP Group, "header," in </w:t>
+      </w:r>
+      <w:r>
+        <w:rPr>
+          <w:i/>
+          <w:iCs/>
+        </w:rPr>
+        <w:t>PHP Manual</w:t>
+      </w:r>
+      <w:r>
+        <w:t>. [Online]. Available: https://www.php.net/manual/en/function.header.php</w:t>
+      </w:r>
+    </w:p>
+    <w:p>
+      <w:pPr>
+        <w:pStyle w:val="csparagraph"/>
+      </w:pPr>
+      <w:r>
+        <w:t xml:space="preserve">[20] Oracle Corporation, "Server SQL modes," in </w:t>
+      </w:r>
+      <w:r>
+        <w:rPr>
+          <w:i/>
+          <w:iCs/>
+        </w:rPr>
+        <w:t>MySQL 5.7 Reference Manual</w:t>
+      </w:r>
+      <w:r>
+        <w:t>. [Online]. Available: https://dev.mysql.com/doc/refman/5.7/en/sql-mode.html</w:t>
+      </w:r>
+    </w:p>
+    <w:p>
+      <w:pPr>
+        <w:pStyle w:val="csparagraph"/>
+      </w:pPr>
+      <w:r>
+        <w:t xml:space="preserve">[21] M. Davis, G. Logemann, and D. Loveland, "A machine program for theorem-proving," </w:t>
+      </w:r>
+      <w:r>
+        <w:rPr>
+          <w:i/>
+          <w:iCs/>
+        </w:rPr>
+        <w:t>Communications of the ACM</w:t>
+      </w:r>
+      <w:r>
+        <w:t>, vol. 5, no. 7, pp. 394–397, 1962.</w:t>
+      </w:r>
+    </w:p>
+    <w:p>
+      <w:pPr>
+        <w:pStyle w:val="csparagraph"/>
+      </w:pPr>
+      <w:r>
+        <w:t xml:space="preserve">[22] L. de Moura and N. Bjørner, "Z3: An efficient SMT solver," in </w:t>
+      </w:r>
+      <w:r>
+        <w:rPr>
+          <w:i/>
+          <w:iCs/>
+        </w:rPr>
+        <w:t>Proc. Tools and Algorithms for the Construction and Analysis of Systems (TACAS 2008)</w:t>
+      </w:r>
+      <w:r>
+        <w:t>, LNCS, vol. 4963. Berlin, Germany: Springer, 2008, pp. 337–340.</w:t>
+      </w:r>
+    </w:p>
+    <w:p>
+      <w:pPr>
+        <w:pStyle w:val="csparagraph"/>
+      </w:pPr>
+      <w:r>
+        <w:t xml:space="preserve">[23] OWASP Foundation, "SQL Injection Prevention Cheat Sheet," </w:t>
+      </w:r>
+      <w:r>
+        <w:rPr>
+          <w:i/>
+          <w:iCs/>
+        </w:rPr>
+        <w:t>OWASP Cheat Sheet Series</w:t>
+      </w:r>
+      <w:r>
+        <w:t>. [Online]. Available: https://cheatsheetseries.owasp.org/cheatsheets/SQL_Injection_Prevention_Cheat_Sheet.html</w:t>
+      </w:r>
+    </w:p>
+    <w:p>
+      <w:pPr>
+        <w:pStyle w:val="csparagraph"/>
+      </w:pPr>
+      <w:r>
+        <w:t xml:space="preserve">[24] OWASP Foundation, "Cross Site Scripting Prevention Cheat Sheet," </w:t>
+      </w:r>
+      <w:r>
+        <w:rPr>
+          <w:i/>
+          <w:iCs/>
+        </w:rPr>
+        <w:t>OWASP Cheat Sheet Series</w:t>
+      </w:r>
+      <w:r>
+        <w:t>. [Online]. Available: https://cheatsheetseries.owasp.org/cheatsheets/Cross_Site_Scripting_Prevention_Cheat_Sheet.html</w:t>
+      </w:r>
+    </w:p>
+    <w:p>
+      <w:pPr>
+        <w:pStyle w:val="csparagraph"/>
+      </w:pPr>
+      <w:r>
+        <w:t xml:space="preserve">[25] OWASP Foundation, "Cross-Site Request Forgery Prevention Cheat Sheet," </w:t>
+      </w:r>
+      <w:r>
+        <w:rPr>
+          <w:i/>
+          <w:iCs/>
+        </w:rPr>
+        <w:t>OWASP Cheat Sheet Series</w:t>
+      </w:r>
+      <w:r>
+        <w:t>. [Online]. Available: https://cheatsheetseries.owasp.org/cheatsheets/Cross-Site_Request_Forgery_Prevention_Cheat_Sheet.html</w:t>
+      </w:r>
+    </w:p>
+    <w:p>
+      <w:pPr>
+        <w:pStyle w:val="csparagraph"/>
+      </w:pPr>
+      <w:r>
+        <w:lastRenderedPageBreak/>
+        <w:t xml:space="preserve">[26] C. Wohlin, P. Runeson, M. Höst, M. C. Ohlsson, B. Regnell, and A. Wesslén, </w:t>
+      </w:r>
+      <w:r>
+        <w:rPr>
+          <w:i/>
+          <w:iCs/>
+        </w:rPr>
+        <w:t>Experimentation in Software Engineering</w:t>
+      </w:r>
+      <w:r>
+        <w:t>. Berlin, Germany: Springer, 2012.</w:t>
+      </w:r>
+    </w:p>
+    <w:p>
+      <w:pPr>
+        <w:pStyle w:val="csparagraph"/>
+      </w:pPr>
+      <w:r>
+        <w:t>[27] Association for Computing Machinery, "ACM Code of Ethics and Professional Conduct," 2018. [Online]. Available: https://www.acm.org/code-of-ethics</w:t>
+      </w:r>
+    </w:p>
+    <w:p>
+      <w:pPr>
+        <w:pStyle w:val="csparagraph"/>
+      </w:pPr>
+      <w:r>
+        <w:t xml:space="preserve">[28] OWASP Foundation, "Password Storage Cheat Sheet," </w:t>
+      </w:r>
+      <w:r>
+        <w:rPr>
+          <w:i/>
+          <w:iCs/>
+        </w:rPr>
+        <w:t>OWASP Cheat Sheet Series</w:t>
+      </w:r>
+      <w:r>
+        <w:t>. [Online]. Available: https://cheatsheetseries.owasp.org/cheatsheets/Password_Storage_Cheat_Sheet.html</w:t>
+      </w:r>
+    </w:p>
+    <w:p>
+      <w:pPr>
+        <w:pStyle w:val="csparagraph"/>
+      </w:pPr>
+      <w:r>
+        <w:t xml:space="preserve">[29] The PHP Group, "Prepared statements and stored procedures," in </w:t>
+      </w:r>
+      <w:r>
+        <w:rPr>
+          <w:i/>
+          <w:iCs/>
+        </w:rPr>
+        <w:t>PHP Manual – PHP Data Objects</w:t>
+      </w:r>
+      <w:r>
+        <w:t>. [Online]. Available: https://www.php.net/manual/en/pdo.prepared-statements.php</w:t>
+      </w:r>
+    </w:p>
+    <w:p>
+      <w:pPr>
+        <w:pStyle w:val="csparagraph"/>
+      </w:pPr>
+      <w:r>
+        <w:t>[30] R. E. Strom and S. Yemini, "Typestate: A programming language concept for enhancing software reliability," IEEE Transactions on Software Engineering, vol. SE-12, no. 1, pp. 157–171, 1986.</w:t>
+      </w:r>
+    </w:p>
+    <w:p>
+      <w:pPr>
+        <w:pStyle w:val="csparagraph"/>
+      </w:pPr>
+      <w:r>
+        <w:t>[31] The PHP Group, "Memory management," in PHP Manual – Mysqlnd. [Online]. Available: https://www.php.net/manual/en/mysqlnd.memory.php</w:t>
+      </w:r>
+    </w:p>
+    <w:p>
+      <w:pPr>
+        <w:pStyle w:val="csparagraph"/>
+      </w:pPr>
+      <w:r>
+        <w:t>[32] The PHP Group, "ext/sodium/libsodium.c," php-src, GitHub repository. [Online]. Available: https://github.com/php/php-src/blob/master/ext/sodium/libsodium.c</w:t>
+      </w:r>
+    </w:p>
+    <w:p>
+      <w:pPr>
+        <w:pStyle w:val="csparagraph"/>
+      </w:pPr>
+      <w:r>
+        <w:t>[33] A. Biere, A. Cimatti, E. Clarke, and Y. Zhu, "Symbolic model checking without BDDs," in Proc. Tools and Algorithms for the Construction and Analysis of Systems (TACAS 1999), LNCS, vol. 1579. Berlin, Germany: Springer, 1999, pp. 193–207.</w:t>
+      </w:r>
+    </w:p>
+    <w:p>
+      <w:pPr>
+        <w:pStyle w:val="csparagraph"/>
+      </w:pPr>
+      <w:r>
+        <w:t>[34] Free Software Foundation, "Options that control static analysis," in Using the GNU Compiler Collection. [Online]. Available: https://gcc.gnu.org/onlinedocs/gcc/Static-Analyzer-Options.html</w:t>
+      </w:r>
+    </w:p>
+    <w:p>
+      <w:pPr>
+        <w:pStyle w:val="csparagraph"/>
+      </w:pPr>
+      <w:r>
+        <w:t>[35] LLVM Project, "Clang Static Analyzer." [Online]. Available: https://clang-analyzer.llvm.org/</w:t>
+      </w:r>
+    </w:p>
+    <w:p>
+      <w:pPr>
+        <w:pStyle w:val="csparagraph"/>
+      </w:pPr>
+      <w:r>
+        <w:t>[36] National Institute of Standards and Technology, "National Vulnerability Database." [Online]. Available: https://nvd.nist.gov/</w:t>
+      </w:r>
+    </w:p>
+    <w:p>
+      <w:pPr>
+        <w:pStyle w:val="Heading2"/>
+        <w:pageBreakBefore/>
+        <w:numPr>
+          <w:ilvl w:val="0"/>
+          <w:numId w:val="0"/>
+        </w:numPr>
+      </w:pPr>
+      <w:bookmarkStart w:id="36" w:name="_Toc243827909"/>
+      <w:r>
+        <w:rPr>
+          <w:lang w:val="vi-VN"/>
+        </w:rPr>
+        <w:lastRenderedPageBreak/>
+        <w:t>11.3 Phụ lục</w:t>
+      </w:r>
+      <w:bookmarkEnd w:id="36"/>
     </w:p>
     <w:p>
       <w:pPr>
@@ -12917,14 +13599,14 @@
           <w:numId w:val="0"/>
         </w:numPr>
       </w:pPr>
-      <w:bookmarkStart w:id="33" w:name="_Toc243599950"/>
+      <w:bookmarkStart w:id="37" w:name="_Toc243827910"/>
       <w:r>
         <w:rPr>
           <w:lang w:val="vi-VN"/>
         </w:rPr>
-        <w:t>7.3.8 Phụ lục H – Mô hình trạng thái và so sánh trước, sau khi sửa</w:t>
-      </w:r>
-      <w:bookmarkEnd w:id="33"/>
+        <w:t>11.3.8 Phụ lục H – Mô hình trạng thái và so sánh trước, sau khi sửa</w:t>
+      </w:r>
+      <w:bookmarkEnd w:id="37"/>
     </w:p>
     <w:p>
       <w:pPr>
@@ -12939,7 +13621,7 @@
         <w:pStyle w:val="Caption"/>
         <w:keepNext/>
       </w:pPr>
-      <w:bookmarkStart w:id="34" w:name="_Toc243599856"/>
+      <w:bookmarkStart w:id="38" w:name="_Toc243599856"/>
       <w:r>
         <w:rPr>
           <w:b/>
@@ -12950,7 +13632,7 @@
         <w:rPr>
           <w:noProof/>
         </w:rPr>
-        <w:t>64</w:t>
+        <w:t>68</w:t>
       </w:r>
       <w:r>
         <w:rPr>
@@ -12961,7 +13643,7 @@
       <w:r>
         <w:t>Mô hình Kripke của luồng xác thực và kết quả kiểm tra CTL</w:t>
       </w:r>
-      <w:bookmarkEnd w:id="34"/>
+      <w:bookmarkEnd w:id="38"/>
     </w:p>
     <w:tbl>
       <w:tblPr>
@@ -13346,7 +14028,7 @@
         <w:pStyle w:val="Caption"/>
         <w:keepNext/>
       </w:pPr>
-      <w:bookmarkStart w:id="35" w:name="_Toc243599857"/>
+      <w:bookmarkStart w:id="39" w:name="_Toc243599857"/>
       <w:r>
         <w:rPr>
           <w:b/>
@@ -13357,7 +14039,7 @@
         <w:rPr>
           <w:noProof/>
         </w:rPr>
-        <w:t>65</w:t>
+        <w:t>69</w:t>
       </w:r>
       <w:r>
         <w:rPr>
@@ -13368,7 +14050,7 @@
       <w:r>
         <w:t>So sánh trước sửa (_v0) và sau sửa (_v1) trên mã minh họa</w:t>
       </w:r>
-      <w:bookmarkEnd w:id="35"/>
+      <w:bookmarkEnd w:id="39"/>
     </w:p>
     <w:tbl>
       <w:tblPr>
@@ -20611,26 +21293,6 @@
 </file>
 
 <file path=customXml/item1.xml><?xml version="1.0" encoding="utf-8"?>
-<p:properties xmlns:p="http://schemas.microsoft.com/office/2006/metadata/properties" xmlns:xsi="http://www.w3.org/2001/XMLSchema-instance" xmlns:pc="http://schemas.microsoft.com/office/infopath/2007/PartnerControls">
-  <documentManagement>
-    <TaxCatchAll xmlns="5d0b22ea-e5ea-49c7-9b62-902e21e51f08" xsi:nil="true"/>
-    <lcf76f155ced4ddcb4097134ff3c332f xmlns="f6f721e1-8a62-40be-993d-f44352021507">
-      <Terms xmlns="http://schemas.microsoft.com/office/infopath/2007/PartnerControls"/>
-    </lcf76f155ced4ddcb4097134ff3c332f>
-  </documentManagement>
-</p:properties>
-</file>
-
-<file path=customXml/item2.xml><?xml version="1.0" encoding="utf-8"?>
-<?mso-contentType ?>
-<FormTemplates xmlns="http://schemas.microsoft.com/sharepoint/v3/contenttype/forms">
-  <Display>DocumentLibraryForm</Display>
-  <Edit>DocumentLibraryForm</Edit>
-  <New>DocumentLibraryForm</New>
-</FormTemplates>
-</file>
-
-<file path=customXml/item3.xml><?xml version="1.0" encoding="utf-8"?>
 <ct:contentTypeSchema xmlns:ct="http://schemas.microsoft.com/office/2006/metadata/contentType" xmlns:ma="http://schemas.microsoft.com/office/2006/metadata/properties/metaAttributes" ct:_="" ma:_="" ma:contentTypeName="Tài liệu" ma:contentTypeID="0x0101009064D6C488808240A931504663625519" ma:contentTypeVersion="14" ma:contentTypeDescription="Tạo tài liệu mới." ma:contentTypeScope="" ma:versionID="917cc4c3b82354d7a8f69433fdf51fae">
   <xsd:schema xmlns:xsd="http://www.w3.org/2001/XMLSchema" xmlns:xs="http://www.w3.org/2001/XMLSchema" xmlns:p="http://schemas.microsoft.com/office/2006/metadata/properties" xmlns:ns2="f6f721e1-8a62-40be-993d-f44352021507" xmlns:ns3="5d0b22ea-e5ea-49c7-9b62-902e21e51f08" targetNamespace="http://schemas.microsoft.com/office/2006/metadata/properties" ma:root="true" ma:fieldsID="2f9312a3ec803083f43100d41fb65ef5" ns2:_="" ns3:_="">
     <xsd:import namespace="f6f721e1-8a62-40be-993d-f44352021507"/>
@@ -20859,30 +21521,31 @@
 </ct:contentTypeSchema>
 </file>
 
-<file path=customXml/item4.xml><?xml version="1.0" encoding="utf-8"?>
+<file path=customXml/item2.xml><?xml version="1.0" encoding="utf-8"?>
 <b:Sources xmlns:b="http://schemas.openxmlformats.org/officeDocument/2006/bibliography" xmlns="http://schemas.openxmlformats.org/officeDocument/2006/bibliography" SelectedStyle="\APASixthEditionOfficeOnline.xsl" StyleName="APA" Version="6"/>
 </file>
 
-<file path=customXml/itemProps1.xml><?xml version="1.0" encoding="utf-8"?>
-<ds:datastoreItem xmlns:ds="http://schemas.openxmlformats.org/officeDocument/2006/customXml" ds:itemID="{ACBFC553-1BE4-4450-B403-7F12C27FE3CA}">
-  <ds:schemaRefs>
-    <ds:schemaRef ds:uri="http://schemas.microsoft.com/office/2006/metadata/properties"/>
-    <ds:schemaRef ds:uri="http://schemas.microsoft.com/office/infopath/2007/PartnerControls"/>
-    <ds:schemaRef ds:uri="5d0b22ea-e5ea-49c7-9b62-902e21e51f08"/>
-    <ds:schemaRef ds:uri="f6f721e1-8a62-40be-993d-f44352021507"/>
-  </ds:schemaRefs>
-</ds:datastoreItem>
+<file path=customXml/item3.xml><?xml version="1.0" encoding="utf-8"?>
+<p:properties xmlns:p="http://schemas.microsoft.com/office/2006/metadata/properties" xmlns:xsi="http://www.w3.org/2001/XMLSchema-instance" xmlns:pc="http://schemas.microsoft.com/office/infopath/2007/PartnerControls">
+  <documentManagement>
+    <TaxCatchAll xmlns="5d0b22ea-e5ea-49c7-9b62-902e21e51f08" xsi:nil="true"/>
+    <lcf76f155ced4ddcb4097134ff3c332f xmlns="f6f721e1-8a62-40be-993d-f44352021507">
+      <Terms xmlns="http://schemas.microsoft.com/office/infopath/2007/PartnerControls"/>
+    </lcf76f155ced4ddcb4097134ff3c332f>
+  </documentManagement>
+</p:properties>
 </file>
 
-<file path=customXml/itemProps2.xml><?xml version="1.0" encoding="utf-8"?>
-<ds:datastoreItem xmlns:ds="http://schemas.openxmlformats.org/officeDocument/2006/customXml" ds:itemID="{4ED417DC-AAC6-4AC2-9B84-BF5AEE7392F8}">
-  <ds:schemaRefs>
-    <ds:schemaRef ds:uri="http://schemas.microsoft.com/sharepoint/v3/contenttype/forms"/>
-  </ds:schemaRefs>
-</ds:datastoreItem>
+<file path=customXml/item4.xml><?xml version="1.0" encoding="utf-8"?>
+<?mso-contentType ?>
+<FormTemplates xmlns="http://schemas.microsoft.com/sharepoint/v3/contenttype/forms">
+  <Display>DocumentLibraryForm</Display>
+  <Edit>DocumentLibraryForm</Edit>
+  <New>DocumentLibraryForm</New>
+</FormTemplates>
 </file>
 
-<file path=customXml/itemProps3.xml><?xml version="1.0" encoding="utf-8"?>
+<file path=customXml/itemProps1.xml><?xml version="1.0" encoding="utf-8"?>
 <ds:datastoreItem xmlns:ds="http://schemas.openxmlformats.org/officeDocument/2006/customXml" ds:itemID="{DA04E85B-2A7D-4814-AE68-20A674C21DD2}">
   <ds:schemaRefs>
     <ds:schemaRef ds:uri="http://schemas.microsoft.com/office/2006/metadata/contentType"/>
@@ -20901,10 +21564,29 @@
 </ds:datastoreItem>
 </file>
 
-<file path=customXml/itemProps4.xml><?xml version="1.0" encoding="utf-8"?>
+<file path=customXml/itemProps2.xml><?xml version="1.0" encoding="utf-8"?>
 <ds:datastoreItem xmlns:ds="http://schemas.openxmlformats.org/officeDocument/2006/customXml" ds:itemID="{06F34B39-710A-4AE8-9B09-0F6110FECC4E}">
   <ds:schemaRefs>
     <ds:schemaRef ds:uri="http://schemas.openxmlformats.org/officeDocument/2006/bibliography"/>
   </ds:schemaRefs>
 </ds:datastoreItem>
+</file>
+
+<file path=customXml/itemProps3.xml><?xml version="1.0" encoding="utf-8"?>
+<ds:datastoreItem xmlns:ds="http://schemas.openxmlformats.org/officeDocument/2006/customXml" ds:itemID="{ACBFC553-1BE4-4450-B403-7F12C27FE3CA}">
+  <ds:schemaRefs>
+    <ds:schemaRef ds:uri="http://schemas.microsoft.com/office/2006/metadata/properties"/>
+    <ds:schemaRef ds:uri="http://schemas.microsoft.com/office/infopath/2007/PartnerControls"/>
+    <ds:schemaRef ds:uri="5d0b22ea-e5ea-49c7-9b62-902e21e51f08"/>
+    <ds:schemaRef ds:uri="f6f721e1-8a62-40be-993d-f44352021507"/>
+  </ds:schemaRefs>
+</ds:datastoreItem>
+</file>
+
+<file path=customXml/itemProps4.xml><?xml version="1.0" encoding="utf-8"?>
+<ds:datastoreItem xmlns:ds="http://schemas.openxmlformats.org/officeDocument/2006/customXml" ds:itemID="{4ED417DC-AAC6-4AC2-9B84-BF5AEE7392F8}">
+  <ds:schemaRefs>
+    <ds:schemaRef ds:uri="http://schemas.microsoft.com/sharepoint/v3/contenttype/forms"/>
+  </ds:schemaRefs>
+</ds:datastoreItem>
 </file>
</xml_diff>

<commit_message>
docs(outputs): tidy Phụ lục H tables, add 5.1.6/5.5.4 test screenshots
- Phụ lục H (Bảng 64–65 in the group report, 68–69 in Việt's excerpt):
  plain text in the "Giới hạn" column with Consolas only for file:line
  refs, formulas at the 10pt table code size, wider last column so no
  file name breaks mid-word. Text unchanged; TOC and PDF regenerated in
  Word (108 and 19 pages, as before).
- outputs/Anh_chay_test_5.1.6_5.5.4/: 15 chon_test.py screenshots for
  sections 5.1.6 and 5.5.4 with proposed captions in CHU_THICH.md, not
  yet inserted into Word.
- chon_test.py: the bo_nho_tinh diagram counts GCC/Clang warnings by
  distinct line–CWE pair, as the run log and Bảng 46 do (authorization.c
  and script_output.c now show GCC 3, not 4).

Co-Authored-By: Claude Opus 5.5 <noreply@anthropic.com>
</commit_message>
<xml_diff>
--- a/outputs/Nhom13_PhanViec_ca_nhan/Nhom13_23010636_NghiemDucViet_PhanViec.docx
+++ b/outputs/Nhom13_PhanViec_ca_nhan/Nhom13_23010636_NghiemDucViet_PhanViec.docx
@@ -611,7 +611,7 @@
           <w:r>
             <w:fldChar w:fldCharType="separate"/>
           </w:r>
-          <w:hyperlink w:anchor="_Toc243827890" w:history="1">
+          <w:hyperlink w:anchor="_Toc243897685" w:history="1">
             <w:r>
               <w:rPr>
                 <w:rStyle w:val="Hyperlink"/>
@@ -638,7 +638,7 @@
                 <w:noProof/>
                 <w:webHidden/>
               </w:rPr>
-              <w:instrText xml:space="preserve"> PAGEREF _Toc243827890 \h </w:instrText>
+              <w:instrText xml:space="preserve"> PAGEREF _Toc243897685 \h </w:instrText>
             </w:r>
             <w:r>
               <w:rPr>
@@ -685,7 +685,7 @@
               <w14:ligatures w14:val="standardContextual"/>
             </w:rPr>
           </w:pPr>
-          <w:hyperlink w:anchor="_Toc243827891" w:history="1">
+          <w:hyperlink w:anchor="_Toc243897686" w:history="1">
             <w:r>
               <w:rPr>
                 <w:rStyle w:val="Hyperlink"/>
@@ -713,7 +713,7 @@
                 <w:noProof/>
                 <w:webHidden/>
               </w:rPr>
-              <w:instrText xml:space="preserve"> PAGEREF _Toc243827891 \h </w:instrText>
+              <w:instrText xml:space="preserve"> PAGEREF _Toc243897686 \h </w:instrText>
             </w:r>
             <w:r>
               <w:rPr>
@@ -759,7 +759,7 @@
               <w14:ligatures w14:val="standardContextual"/>
             </w:rPr>
           </w:pPr>
-          <w:hyperlink w:anchor="_Toc243827892" w:history="1">
+          <w:hyperlink w:anchor="_Toc243897687" w:history="1">
             <w:r>
               <w:rPr>
                 <w:rStyle w:val="Hyperlink"/>
@@ -787,7 +787,7 @@
                 <w:noProof/>
                 <w:webHidden/>
               </w:rPr>
-              <w:instrText xml:space="preserve"> PAGEREF _Toc243827892 \h </w:instrText>
+              <w:instrText xml:space="preserve"> PAGEREF _Toc243897687 \h </w:instrText>
             </w:r>
             <w:r>
               <w:rPr>
@@ -833,7 +833,7 @@
               <w14:ligatures w14:val="standardContextual"/>
             </w:rPr>
           </w:pPr>
-          <w:hyperlink w:anchor="_Toc243827893" w:history="1">
+          <w:hyperlink w:anchor="_Toc243897688" w:history="1">
             <w:r>
               <w:rPr>
                 <w:rStyle w:val="Hyperlink"/>
@@ -861,7 +861,7 @@
                 <w:noProof/>
                 <w:webHidden/>
               </w:rPr>
-              <w:instrText xml:space="preserve"> PAGEREF _Toc243827893 \h </w:instrText>
+              <w:instrText xml:space="preserve"> PAGEREF _Toc243897688 \h </w:instrText>
             </w:r>
             <w:r>
               <w:rPr>
@@ -908,7 +908,7 @@
               <w14:ligatures w14:val="standardContextual"/>
             </w:rPr>
           </w:pPr>
-          <w:hyperlink w:anchor="_Toc243827894" w:history="1">
+          <w:hyperlink w:anchor="_Toc243897689" w:history="1">
             <w:r>
               <w:rPr>
                 <w:rStyle w:val="Hyperlink"/>
@@ -936,7 +936,7 @@
                 <w:noProof/>
                 <w:webHidden/>
               </w:rPr>
-              <w:instrText xml:space="preserve"> PAGEREF _Toc243827894 \h </w:instrText>
+              <w:instrText xml:space="preserve"> PAGEREF _Toc243897689 \h </w:instrText>
             </w:r>
             <w:r>
               <w:rPr>
@@ -982,7 +982,7 @@
               <w14:ligatures w14:val="standardContextual"/>
             </w:rPr>
           </w:pPr>
-          <w:hyperlink w:anchor="_Toc243827895" w:history="1">
+          <w:hyperlink w:anchor="_Toc243897690" w:history="1">
             <w:r>
               <w:rPr>
                 <w:rStyle w:val="Hyperlink"/>
@@ -1010,7 +1010,7 @@
                 <w:noProof/>
                 <w:webHidden/>
               </w:rPr>
-              <w:instrText xml:space="preserve"> PAGEREF _Toc243827895 \h </w:instrText>
+              <w:instrText xml:space="preserve"> PAGEREF _Toc243897690 \h </w:instrText>
             </w:r>
             <w:r>
               <w:rPr>
@@ -1056,7 +1056,7 @@
               <w14:ligatures w14:val="standardContextual"/>
             </w:rPr>
           </w:pPr>
-          <w:hyperlink w:anchor="_Toc243827896" w:history="1">
+          <w:hyperlink w:anchor="_Toc243897691" w:history="1">
             <w:r>
               <w:rPr>
                 <w:rStyle w:val="Hyperlink"/>
@@ -1084,7 +1084,7 @@
                 <w:noProof/>
                 <w:webHidden/>
               </w:rPr>
-              <w:instrText xml:space="preserve"> PAGEREF _Toc243827896 \h </w:instrText>
+              <w:instrText xml:space="preserve"> PAGEREF _Toc243897691 \h </w:instrText>
             </w:r>
             <w:r>
               <w:rPr>
@@ -1130,7 +1130,7 @@
               <w14:ligatures w14:val="standardContextual"/>
             </w:rPr>
           </w:pPr>
-          <w:hyperlink w:anchor="_Toc243827897" w:history="1">
+          <w:hyperlink w:anchor="_Toc243897692" w:history="1">
             <w:r>
               <w:rPr>
                 <w:rStyle w:val="Hyperlink"/>
@@ -1158,7 +1158,7 @@
                 <w:noProof/>
                 <w:webHidden/>
               </w:rPr>
-              <w:instrText xml:space="preserve"> PAGEREF _Toc243827897 \h </w:instrText>
+              <w:instrText xml:space="preserve"> PAGEREF _Toc243897692 \h </w:instrText>
             </w:r>
             <w:r>
               <w:rPr>
@@ -1204,7 +1204,7 @@
               <w14:ligatures w14:val="standardContextual"/>
             </w:rPr>
           </w:pPr>
-          <w:hyperlink w:anchor="_Toc243827898" w:history="1">
+          <w:hyperlink w:anchor="_Toc243897693" w:history="1">
             <w:r>
               <w:rPr>
                 <w:rStyle w:val="Hyperlink"/>
@@ -1232,7 +1232,7 @@
                 <w:noProof/>
                 <w:webHidden/>
               </w:rPr>
-              <w:instrText xml:space="preserve"> PAGEREF _Toc243827898 \h </w:instrText>
+              <w:instrText xml:space="preserve"> PAGEREF _Toc243897693 \h </w:instrText>
             </w:r>
             <w:r>
               <w:rPr>
@@ -1278,7 +1278,7 @@
               <w14:ligatures w14:val="standardContextual"/>
             </w:rPr>
           </w:pPr>
-          <w:hyperlink w:anchor="_Toc243827899" w:history="1">
+          <w:hyperlink w:anchor="_Toc243897694" w:history="1">
             <w:r>
               <w:rPr>
                 <w:rStyle w:val="Hyperlink"/>
@@ -1306,7 +1306,7 @@
                 <w:noProof/>
                 <w:webHidden/>
               </w:rPr>
-              <w:instrText xml:space="preserve"> PAGEREF _Toc243827899 \h </w:instrText>
+              <w:instrText xml:space="preserve"> PAGEREF _Toc243897694 \h </w:instrText>
             </w:r>
             <w:r>
               <w:rPr>
@@ -1352,7 +1352,7 @@
               <w14:ligatures w14:val="standardContextual"/>
             </w:rPr>
           </w:pPr>
-          <w:hyperlink w:anchor="_Toc243827900" w:history="1">
+          <w:hyperlink w:anchor="_Toc243897695" w:history="1">
             <w:r>
               <w:rPr>
                 <w:rStyle w:val="Hyperlink"/>
@@ -1380,7 +1380,7 @@
                 <w:noProof/>
                 <w:webHidden/>
               </w:rPr>
-              <w:instrText xml:space="preserve"> PAGEREF _Toc243827900 \h </w:instrText>
+              <w:instrText xml:space="preserve"> PAGEREF _Toc243897695 \h </w:instrText>
             </w:r>
             <w:r>
               <w:rPr>
@@ -1426,7 +1426,7 @@
               <w14:ligatures w14:val="standardContextual"/>
             </w:rPr>
           </w:pPr>
-          <w:hyperlink w:anchor="_Toc243827901" w:history="1">
+          <w:hyperlink w:anchor="_Toc243897696" w:history="1">
             <w:r>
               <w:rPr>
                 <w:rStyle w:val="Hyperlink"/>
@@ -1454,7 +1454,7 @@
                 <w:noProof/>
                 <w:webHidden/>
               </w:rPr>
-              <w:instrText xml:space="preserve"> PAGEREF _Toc243827901 \h </w:instrText>
+              <w:instrText xml:space="preserve"> PAGEREF _Toc243897696 \h </w:instrText>
             </w:r>
             <w:r>
               <w:rPr>
@@ -1500,7 +1500,7 @@
               <w14:ligatures w14:val="standardContextual"/>
             </w:rPr>
           </w:pPr>
-          <w:hyperlink w:anchor="_Toc243827902" w:history="1">
+          <w:hyperlink w:anchor="_Toc243897697" w:history="1">
             <w:r>
               <w:rPr>
                 <w:rStyle w:val="Hyperlink"/>
@@ -1528,7 +1528,7 @@
                 <w:noProof/>
                 <w:webHidden/>
               </w:rPr>
-              <w:instrText xml:space="preserve"> PAGEREF _Toc243827902 \h </w:instrText>
+              <w:instrText xml:space="preserve"> PAGEREF _Toc243897697 \h </w:instrText>
             </w:r>
             <w:r>
               <w:rPr>
@@ -1575,7 +1575,7 @@
               <w14:ligatures w14:val="standardContextual"/>
             </w:rPr>
           </w:pPr>
-          <w:hyperlink w:anchor="_Toc243827903" w:history="1">
+          <w:hyperlink w:anchor="_Toc243897698" w:history="1">
             <w:r>
               <w:rPr>
                 <w:rStyle w:val="Hyperlink"/>
@@ -1602,7 +1602,7 @@
                 <w:noProof/>
                 <w:webHidden/>
               </w:rPr>
-              <w:instrText xml:space="preserve"> PAGEREF _Toc243827903 \h </w:instrText>
+              <w:instrText xml:space="preserve"> PAGEREF _Toc243897698 \h </w:instrText>
             </w:r>
             <w:r>
               <w:rPr>
@@ -1648,7 +1648,7 @@
               <w14:ligatures w14:val="standardContextual"/>
             </w:rPr>
           </w:pPr>
-          <w:hyperlink w:anchor="_Toc243827904" w:history="1">
+          <w:hyperlink w:anchor="_Toc243897699" w:history="1">
             <w:r>
               <w:rPr>
                 <w:rStyle w:val="Hyperlink"/>
@@ -1675,7 +1675,7 @@
                 <w:noProof/>
                 <w:webHidden/>
               </w:rPr>
-              <w:instrText xml:space="preserve"> PAGEREF _Toc243827904 \h </w:instrText>
+              <w:instrText xml:space="preserve"> PAGEREF _Toc243897699 \h </w:instrText>
             </w:r>
             <w:r>
               <w:rPr>
@@ -1721,7 +1721,7 @@
               <w14:ligatures w14:val="standardContextual"/>
             </w:rPr>
           </w:pPr>
-          <w:hyperlink w:anchor="_Toc243827905" w:history="1">
+          <w:hyperlink w:anchor="_Toc243897700" w:history="1">
             <w:r>
               <w:rPr>
                 <w:rStyle w:val="Hyperlink"/>
@@ -1748,7 +1748,7 @@
                 <w:noProof/>
                 <w:webHidden/>
               </w:rPr>
-              <w:instrText xml:space="preserve"> PAGEREF _Toc243827905 \h </w:instrText>
+              <w:instrText xml:space="preserve"> PAGEREF _Toc243897700 \h </w:instrText>
             </w:r>
             <w:r>
               <w:rPr>
@@ -1794,7 +1794,7 @@
               <w14:ligatures w14:val="standardContextual"/>
             </w:rPr>
           </w:pPr>
-          <w:hyperlink w:anchor="_Toc243827906" w:history="1">
+          <w:hyperlink w:anchor="_Toc243897701" w:history="1">
             <w:r>
               <w:rPr>
                 <w:rStyle w:val="Hyperlink"/>
@@ -1821,7 +1821,7 @@
                 <w:noProof/>
                 <w:webHidden/>
               </w:rPr>
-              <w:instrText xml:space="preserve"> PAGEREF _Toc243827906 \h </w:instrText>
+              <w:instrText xml:space="preserve"> PAGEREF _Toc243897701 \h </w:instrText>
             </w:r>
             <w:r>
               <w:rPr>
@@ -1868,7 +1868,7 @@
               <w14:ligatures w14:val="standardContextual"/>
             </w:rPr>
           </w:pPr>
-          <w:hyperlink w:anchor="_Toc243827907" w:history="1">
+          <w:hyperlink w:anchor="_Toc243897702" w:history="1">
             <w:r>
               <w:rPr>
                 <w:rStyle w:val="Hyperlink"/>
@@ -1896,7 +1896,7 @@
                 <w:noProof/>
                 <w:webHidden/>
               </w:rPr>
-              <w:instrText xml:space="preserve"> PAGEREF _Toc243827907 \h </w:instrText>
+              <w:instrText xml:space="preserve"> PAGEREF _Toc243897702 \h </w:instrText>
             </w:r>
             <w:r>
               <w:rPr>
@@ -1942,7 +1942,7 @@
               <w14:ligatures w14:val="standardContextual"/>
             </w:rPr>
           </w:pPr>
-          <w:hyperlink w:anchor="_Toc243827908" w:history="1">
+          <w:hyperlink w:anchor="_Toc243897703" w:history="1">
             <w:r>
               <w:rPr>
                 <w:rStyle w:val="Hyperlink"/>
@@ -1970,7 +1970,7 @@
                 <w:noProof/>
                 <w:webHidden/>
               </w:rPr>
-              <w:instrText xml:space="preserve"> PAGEREF _Toc243827908 \h </w:instrText>
+              <w:instrText xml:space="preserve"> PAGEREF _Toc243897703 \h </w:instrText>
             </w:r>
             <w:r>
               <w:rPr>
@@ -2016,7 +2016,7 @@
               <w14:ligatures w14:val="standardContextual"/>
             </w:rPr>
           </w:pPr>
-          <w:hyperlink w:anchor="_Toc243827909" w:history="1">
+          <w:hyperlink w:anchor="_Toc243897704" w:history="1">
             <w:r>
               <w:rPr>
                 <w:rStyle w:val="Hyperlink"/>
@@ -2044,7 +2044,7 @@
                 <w:noProof/>
                 <w:webHidden/>
               </w:rPr>
-              <w:instrText xml:space="preserve"> PAGEREF _Toc243827909 \h </w:instrText>
+              <w:instrText xml:space="preserve"> PAGEREF _Toc243897704 \h </w:instrText>
             </w:r>
             <w:r>
               <w:rPr>
@@ -2090,7 +2090,7 @@
               <w14:ligatures w14:val="standardContextual"/>
             </w:rPr>
           </w:pPr>
-          <w:hyperlink w:anchor="_Toc243827910" w:history="1">
+          <w:hyperlink w:anchor="_Toc243897705" w:history="1">
             <w:r>
               <w:rPr>
                 <w:rStyle w:val="Hyperlink"/>
@@ -2118,7 +2118,7 @@
                 <w:noProof/>
                 <w:webHidden/>
               </w:rPr>
-              <w:instrText xml:space="preserve"> PAGEREF _Toc243827910 \h </w:instrText>
+              <w:instrText xml:space="preserve"> PAGEREF _Toc243897705 \h </w:instrText>
             </w:r>
             <w:r>
               <w:rPr>
@@ -2168,7 +2168,7 @@
         </w:numPr>
       </w:pPr>
       <w:bookmarkStart w:id="5" w:name="_Toc175554962"/>
-      <w:bookmarkStart w:id="6" w:name="_Toc243827890"/>
+      <w:bookmarkStart w:id="6" w:name="_Toc243897685"/>
       <w:r>
         <w:t>Phân công thực hiện đồ án</w:t>
       </w:r>
@@ -2921,7 +2921,7 @@
           <w:numId w:val="0"/>
         </w:numPr>
       </w:pPr>
-      <w:bookmarkStart w:id="7" w:name="_Toc243827891"/>
+      <w:bookmarkStart w:id="7" w:name="_Toc243897686"/>
       <w:r>
         <w:rPr>
           <w:lang w:val="vi-VN"/>
@@ -2939,7 +2939,7 @@
           <w:numId w:val="0"/>
         </w:numPr>
       </w:pPr>
-      <w:bookmarkStart w:id="8" w:name="_Toc243827892"/>
+      <w:bookmarkStart w:id="8" w:name="_Toc243897687"/>
       <w:r>
         <w:rPr>
           <w:lang w:val="vi-VN"/>
@@ -2957,7 +2957,7 @@
           <w:numId w:val="0"/>
         </w:numPr>
       </w:pPr>
-      <w:bookmarkStart w:id="9" w:name="_Toc243827893"/>
+      <w:bookmarkStart w:id="9" w:name="_Toc243897688"/>
       <w:r>
         <w:rPr>
           <w:lang w:val="vi-VN"/>
@@ -3134,7 +3134,7 @@
           <w:numId w:val="0"/>
         </w:numPr>
       </w:pPr>
-      <w:bookmarkStart w:id="10" w:name="_Toc243827894"/>
+      <w:bookmarkStart w:id="10" w:name="_Toc243897689"/>
       <w:r>
         <w:rPr>
           <w:lang w:val="vi-VN"/>
@@ -3152,7 +3152,7 @@
           <w:numId w:val="0"/>
         </w:numPr>
       </w:pPr>
-      <w:bookmarkStart w:id="11" w:name="_Toc243827895"/>
+      <w:bookmarkStart w:id="11" w:name="_Toc243897690"/>
       <w:r>
         <w:rPr>
           <w:lang w:val="vi-VN"/>
@@ -3170,7 +3170,7 @@
           <w:numId w:val="0"/>
         </w:numPr>
       </w:pPr>
-      <w:bookmarkStart w:id="12" w:name="_Toc243827896"/>
+      <w:bookmarkStart w:id="12" w:name="_Toc243897691"/>
       <w:r>
         <w:rPr>
           <w:lang w:val="vi-VN"/>
@@ -3747,7 +3747,7 @@
           <w:numId w:val="0"/>
         </w:numPr>
       </w:pPr>
-      <w:bookmarkStart w:id="14" w:name="_Toc243827897"/>
+      <w:bookmarkStart w:id="14" w:name="_Toc243897692"/>
       <w:r>
         <w:rPr>
           <w:lang w:val="vi-VN"/>
@@ -3783,7 +3783,7 @@
           <w:numId w:val="0"/>
         </w:numPr>
       </w:pPr>
-      <w:bookmarkStart w:id="15" w:name="_Toc243827898"/>
+      <w:bookmarkStart w:id="15" w:name="_Toc243897693"/>
       <w:r>
         <w:rPr>
           <w:lang w:val="vi-VN"/>
@@ -4876,7 +4876,7 @@
           <w:numId w:val="0"/>
         </w:numPr>
       </w:pPr>
-      <w:bookmarkStart w:id="17" w:name="_Toc243827899"/>
+      <w:bookmarkStart w:id="17" w:name="_Toc243897694"/>
       <w:r>
         <w:rPr>
           <w:lang w:val="vi-VN"/>
@@ -7037,7 +7037,7 @@
           <w:numId w:val="0"/>
         </w:numPr>
       </w:pPr>
-      <w:bookmarkStart w:id="21" w:name="_Toc243827900"/>
+      <w:bookmarkStart w:id="21" w:name="_Toc243897695"/>
       <w:r>
         <w:rPr>
           <w:lang w:val="vi-VN"/>
@@ -8919,7 +8919,7 @@
           <w:numId w:val="0"/>
         </w:numPr>
       </w:pPr>
-      <w:bookmarkStart w:id="24" w:name="_Toc243827901"/>
+      <w:bookmarkStart w:id="24" w:name="_Toc243897696"/>
       <w:r>
         <w:rPr>
           <w:lang w:val="vi-VN"/>
@@ -11690,7 +11690,7 @@
           <w:numId w:val="0"/>
         </w:numPr>
       </w:pPr>
-      <w:bookmarkStart w:id="28" w:name="_Toc243827902"/>
+      <w:bookmarkStart w:id="28" w:name="_Toc243897697"/>
       <w:r>
         <w:rPr>
           <w:lang w:val="vi-VN"/>
@@ -12692,7 +12692,7 @@
           <w:numId w:val="0"/>
         </w:numPr>
       </w:pPr>
-      <w:bookmarkStart w:id="30" w:name="_Toc243827903"/>
+      <w:bookmarkStart w:id="30" w:name="_Toc243897698"/>
       <w:r>
         <w:lastRenderedPageBreak/>
         <w:t>10. Phản biện &amp; Bài học</w:t>
@@ -12715,7 +12715,7 @@
           <w:numId w:val="0"/>
         </w:numPr>
       </w:pPr>
-      <w:bookmarkStart w:id="31" w:name="_Toc243827904"/>
+      <w:bookmarkStart w:id="31" w:name="_Toc243897699"/>
       <w:r>
         <w:t>10.1 Nếu làm lại từ đầu, nhóm sẽ thiết kế khác ở đâu?</w:t>
       </w:r>
@@ -12842,7 +12842,7 @@
           <w:numId w:val="0"/>
         </w:numPr>
       </w:pPr>
-      <w:bookmarkStart w:id="32" w:name="_Toc243827905"/>
+      <w:bookmarkStart w:id="32" w:name="_Toc243897700"/>
       <w:r>
         <w:t>10.2 Lỗ hổng nào nhóm nghi còn tồn tại nhưng chưa xác nhận?</w:t>
       </w:r>
@@ -13011,7 +13011,7 @@
           <w:numId w:val="0"/>
         </w:numPr>
       </w:pPr>
-      <w:bookmarkStart w:id="33" w:name="_Toc243827906"/>
+      <w:bookmarkStart w:id="33" w:name="_Toc243897701"/>
       <w:r>
         <w:lastRenderedPageBreak/>
         <w:t>10.3 Bài học lớn nhất về phương pháp</w:t>
@@ -13054,7 +13054,7 @@
           <w:numId w:val="0"/>
         </w:numPr>
       </w:pPr>
-      <w:bookmarkStart w:id="34" w:name="_Toc243827907"/>
+      <w:bookmarkStart w:id="34" w:name="_Toc243897702"/>
       <w:r>
         <w:rPr>
           <w:lang w:val="vi-VN"/>
@@ -13072,7 +13072,7 @@
           <w:numId w:val="0"/>
         </w:numPr>
       </w:pPr>
-      <w:bookmarkStart w:id="35" w:name="_Toc243827908"/>
+      <w:bookmarkStart w:id="35" w:name="_Toc243897703"/>
       <w:r>
         <w:rPr>
           <w:lang w:val="vi-VN"/>
@@ -13580,7 +13580,7 @@
           <w:numId w:val="0"/>
         </w:numPr>
       </w:pPr>
-      <w:bookmarkStart w:id="36" w:name="_Toc243827909"/>
+      <w:bookmarkStart w:id="36" w:name="_Toc243897704"/>
       <w:r>
         <w:rPr>
           <w:lang w:val="vi-VN"/>
@@ -13599,7 +13599,7 @@
           <w:numId w:val="0"/>
         </w:numPr>
       </w:pPr>
-      <w:bookmarkStart w:id="37" w:name="_Toc243827910"/>
+      <w:bookmarkStart w:id="37" w:name="_Toc243897705"/>
       <w:r>
         <w:rPr>
           <w:lang w:val="vi-VN"/>
@@ -13659,10 +13659,10 @@
         <w:tblLook w:val="04A0" w:firstRow="1" w:lastRow="0" w:firstColumn="1" w:lastColumn="0" w:noHBand="0" w:noVBand="1"/>
       </w:tblPr>
       <w:tblGrid>
-        <w:gridCol w:w="2433"/>
-        <w:gridCol w:w="2434"/>
-        <w:gridCol w:w="2434"/>
-        <w:gridCol w:w="2059"/>
+        <w:gridCol w:w="2200"/>
+        <w:gridCol w:w="2760"/>
+        <w:gridCol w:w="2000"/>
+        <w:gridCol w:w="2400"/>
       </w:tblGrid>
       <w:tr>
         <w:trPr>
@@ -13671,7 +13671,7 @@
         </w:trPr>
         <w:tc>
           <w:tcPr>
-            <w:tcW w:w="2433" w:type="dxa"/>
+            <w:tcW w:w="2200" w:type="dxa"/>
             <w:shd w:val="clear" w:color="auto" w:fill="D9E2F3"/>
             <w:vAlign w:val="center"/>
           </w:tcPr>
@@ -13693,7 +13693,7 @@
         </w:tc>
         <w:tc>
           <w:tcPr>
-            <w:tcW w:w="2433" w:type="dxa"/>
+            <w:tcW w:w="2760" w:type="dxa"/>
             <w:shd w:val="clear" w:color="auto" w:fill="D9E2F3"/>
             <w:vAlign w:val="center"/>
           </w:tcPr>
@@ -13715,7 +13715,7 @@
         </w:tc>
         <w:tc>
           <w:tcPr>
-            <w:tcW w:w="2433" w:type="dxa"/>
+            <w:tcW w:w="2000" w:type="dxa"/>
             <w:shd w:val="clear" w:color="auto" w:fill="D9E2F3"/>
             <w:vAlign w:val="center"/>
           </w:tcPr>
@@ -13737,7 +13737,7 @@
         </w:tc>
         <w:tc>
           <w:tcPr>
-            <w:tcW w:w="2059" w:type="dxa"/>
+            <w:tcW w:w="2400" w:type="dxa"/>
             <w:shd w:val="clear" w:color="auto" w:fill="D9E2F3"/>
             <w:vAlign w:val="center"/>
           </w:tcPr>
@@ -13764,7 +13764,7 @@
         </w:trPr>
         <w:tc>
           <w:tcPr>
-            <w:tcW w:w="2433" w:type="dxa"/>
+            <w:tcW w:w="2200" w:type="dxa"/>
             <w:vAlign w:val="center"/>
           </w:tcPr>
           <w:p>
@@ -13783,7 +13783,7 @@
         </w:tc>
         <w:tc>
           <w:tcPr>
-            <w:tcW w:w="2433" w:type="dxa"/>
+            <w:tcW w:w="2760" w:type="dxa"/>
             <w:vAlign w:val="center"/>
           </w:tcPr>
           <w:p>
@@ -13802,7 +13802,7 @@
         </w:tc>
         <w:tc>
           <w:tcPr>
-            <w:tcW w:w="2433" w:type="dxa"/>
+            <w:tcW w:w="2000" w:type="dxa"/>
             <w:vAlign w:val="center"/>
           </w:tcPr>
           <w:p>
@@ -13821,19 +13821,65 @@
         </w:tc>
         <w:tc>
           <w:tcPr>
-            <w:tcW w:w="2059" w:type="dxa"/>
-            <w:vAlign w:val="center"/>
-          </w:tcPr>
-          <w:p>
-            <w:pPr>
-              <w:jc w:val="left"/>
-            </w:pPr>
+            <w:tcW w:w="2400" w:type="dxa"/>
+            <w:vAlign w:val="center"/>
+          </w:tcPr>
+          <w:p>
+            <w:pPr>
+              <w:jc w:val="left"/>
+            </w:pPr>
+            <w:r>
+              <w:rPr>
+                <w:sz w:val="22"/>
+                <w:szCs w:val="22"/>
+                <w:lang w:val="vi-VN"/>
+              </w:rPr>
+              <w:t xml:space="preserve">Dựng thủ công từ </w:t>
+            </w:r>
             <w:r>
               <w:rPr>
                 <w:rFonts w:ascii="Consolas" w:hAnsi="Consolas" w:cs="Consolas"/>
                 <w:lang w:val="vi-VN"/>
               </w:rPr>
-              <w:t>Dựng thủ công từ session.php:5–7, login.php:10–12, delete_user.php:2–6; vòng tự lặp ở trạng thái cuối do mô hình thêm</w:t>
+              <w:t>session.php:5–7</w:t>
+            </w:r>
+            <w:r>
+              <w:rPr>
+                <w:sz w:val="22"/>
+                <w:szCs w:val="22"/>
+                <w:lang w:val="vi-VN"/>
+              </w:rPr>
+              <w:t xml:space="preserve">, </w:t>
+            </w:r>
+            <w:r>
+              <w:rPr>
+                <w:rFonts w:ascii="Consolas" w:hAnsi="Consolas" w:cs="Consolas"/>
+                <w:lang w:val="vi-VN"/>
+              </w:rPr>
+              <w:t>login.php:10–12</w:t>
+            </w:r>
+            <w:r>
+              <w:rPr>
+                <w:sz w:val="22"/>
+                <w:szCs w:val="22"/>
+                <w:lang w:val="vi-VN"/>
+              </w:rPr>
+              <w:t xml:space="preserve">, </w:t>
+            </w:r>
+            <w:r>
+              <w:rPr>
+                <w:rFonts w:ascii="Consolas" w:hAnsi="Consolas" w:cs="Consolas"/>
+                <w:lang w:val="vi-VN"/>
+              </w:rPr>
+              <w:t>delete_user.php:2–6</w:t>
+            </w:r>
+            <w:r>
+              <w:rPr>
+                <w:sz w:val="22"/>
+                <w:szCs w:val="22"/>
+                <w:lang w:val="vi-VN"/>
+              </w:rPr>
+              <w:t>; vòng tự lặp ở trạng thái cuối do mô hình thêm</w:t>
             </w:r>
           </w:p>
         </w:tc>
@@ -13844,7 +13890,7 @@
         </w:trPr>
         <w:tc>
           <w:tcPr>
-            <w:tcW w:w="2433" w:type="dxa"/>
+            <w:tcW w:w="2200" w:type="dxa"/>
             <w:vAlign w:val="center"/>
           </w:tcPr>
           <w:p>
@@ -13854,8 +13900,6 @@
             <w:r>
               <w:rPr>
                 <w:rFonts w:ascii="Consolas" w:hAnsi="Consolas" w:cs="Consolas"/>
-                <w:sz w:val="24"/>
-                <w:szCs w:val="24"/>
               </w:rPr>
               <w:t>AG(write → authenticated)</w:t>
             </w:r>
@@ -13863,7 +13907,7 @@
         </w:tc>
         <w:tc>
           <w:tcPr>
-            <w:tcW w:w="2433" w:type="dxa"/>
+            <w:tcW w:w="2760" w:type="dxa"/>
             <w:vAlign w:val="center"/>
           </w:tcPr>
           <w:p>
@@ -13882,7 +13926,7 @@
         </w:tc>
         <w:tc>
           <w:tcPr>
-            <w:tcW w:w="2433" w:type="dxa"/>
+            <w:tcW w:w="2000" w:type="dxa"/>
             <w:vAlign w:val="center"/>
           </w:tcPr>
           <w:p>
@@ -13901,16 +13945,17 @@
         </w:tc>
         <w:tc>
           <w:tcPr>
-            <w:tcW w:w="2059" w:type="dxa"/>
-            <w:vAlign w:val="center"/>
-          </w:tcPr>
-          <w:p>
-            <w:pPr>
-              <w:jc w:val="left"/>
-            </w:pPr>
-            <w:r>
-              <w:rPr>
-                <w:rFonts w:ascii="Consolas" w:hAnsi="Consolas" w:cs="Consolas"/>
+            <w:tcW w:w="2400" w:type="dxa"/>
+            <w:vAlign w:val="center"/>
+          </w:tcPr>
+          <w:p>
+            <w:pPr>
+              <w:jc w:val="left"/>
+            </w:pPr>
+            <w:r>
+              <w:rPr>
+                <w:sz w:val="22"/>
+                <w:szCs w:val="22"/>
                 <w:lang w:val="vi-VN"/>
               </w:rPr>
               <w:t>Giả định endpoint gọi trực tiếp được và truy vấn thành công</w:t>
@@ -13924,7 +13969,7 @@
         </w:trPr>
         <w:tc>
           <w:tcPr>
-            <w:tcW w:w="2433" w:type="dxa"/>
+            <w:tcW w:w="2200" w:type="dxa"/>
             <w:vAlign w:val="center"/>
           </w:tcPr>
           <w:p>
@@ -13934,8 +13979,6 @@
             <w:r>
               <w:rPr>
                 <w:rFonts w:ascii="Consolas" w:hAnsi="Consolas" w:cs="Consolas"/>
-                <w:sz w:val="24"/>
-                <w:szCs w:val="24"/>
               </w:rPr>
               <w:t>EF(denied)</w:t>
             </w:r>
@@ -13950,8 +13993,6 @@
             <w:r>
               <w:rPr>
                 <w:rFonts w:ascii="Consolas" w:hAnsi="Consolas" w:cs="Consolas"/>
-                <w:sz w:val="24"/>
-                <w:szCs w:val="24"/>
               </w:rPr>
               <w:t>EF(authenticated)</w:t>
             </w:r>
@@ -13959,7 +14000,7 @@
         </w:tc>
         <w:tc>
           <w:tcPr>
-            <w:tcW w:w="2433" w:type="dxa"/>
+            <w:tcW w:w="2760" w:type="dxa"/>
             <w:vAlign w:val="center"/>
           </w:tcPr>
           <w:p>
@@ -13978,7 +14019,7 @@
         </w:tc>
         <w:tc>
           <w:tcPr>
-            <w:tcW w:w="2433" w:type="dxa"/>
+            <w:tcW w:w="2000" w:type="dxa"/>
             <w:vAlign w:val="center"/>
           </w:tcPr>
           <w:p>
@@ -13997,16 +14038,17 @@
         </w:tc>
         <w:tc>
           <w:tcPr>
-            <w:tcW w:w="2059" w:type="dxa"/>
-            <w:vAlign w:val="center"/>
-          </w:tcPr>
-          <w:p>
-            <w:pPr>
-              <w:jc w:val="left"/>
-            </w:pPr>
-            <w:r>
-              <w:rPr>
-                <w:rFonts w:ascii="Consolas" w:hAnsi="Consolas" w:cs="Consolas"/>
+            <w:tcW w:w="2400" w:type="dxa"/>
+            <w:vAlign w:val="center"/>
+          </w:tcPr>
+          <w:p>
+            <w:pPr>
+              <w:jc w:val="left"/>
+            </w:pPr>
+            <w:r>
+              <w:rPr>
+                <w:sz w:val="22"/>
+                <w:szCs w:val="22"/>
                 <w:lang w:val="vi-VN"/>
               </w:rPr>
               <w:t>Không chứng minh tính sống của hệ thống thật</w:t>
@@ -14066,10 +14108,10 @@
         <w:tblLook w:val="04A0" w:firstRow="1" w:lastRow="0" w:firstColumn="1" w:lastColumn="0" w:noHBand="0" w:noVBand="1"/>
       </w:tblPr>
       <w:tblGrid>
-        <w:gridCol w:w="2433"/>
-        <w:gridCol w:w="2434"/>
-        <w:gridCol w:w="2434"/>
-        <w:gridCol w:w="2059"/>
+        <w:gridCol w:w="2600"/>
+        <w:gridCol w:w="2100"/>
+        <w:gridCol w:w="2100"/>
+        <w:gridCol w:w="2560"/>
       </w:tblGrid>
       <w:tr>
         <w:trPr>
@@ -14078,7 +14120,7 @@
         </w:trPr>
         <w:tc>
           <w:tcPr>
-            <w:tcW w:w="2433" w:type="dxa"/>
+            <w:tcW w:w="2600" w:type="dxa"/>
             <w:shd w:val="clear" w:color="auto" w:fill="D9E2F3"/>
             <w:vAlign w:val="center"/>
           </w:tcPr>
@@ -14100,7 +14142,7 @@
         </w:tc>
         <w:tc>
           <w:tcPr>
-            <w:tcW w:w="2433" w:type="dxa"/>
+            <w:tcW w:w="2100" w:type="dxa"/>
             <w:shd w:val="clear" w:color="auto" w:fill="D9E2F3"/>
             <w:vAlign w:val="center"/>
           </w:tcPr>
@@ -14122,7 +14164,7 @@
         </w:tc>
         <w:tc>
           <w:tcPr>
-            <w:tcW w:w="2433" w:type="dxa"/>
+            <w:tcW w:w="2100" w:type="dxa"/>
             <w:shd w:val="clear" w:color="auto" w:fill="D9E2F3"/>
             <w:vAlign w:val="center"/>
           </w:tcPr>
@@ -14144,7 +14186,7 @@
         </w:tc>
         <w:tc>
           <w:tcPr>
-            <w:tcW w:w="2059" w:type="dxa"/>
+            <w:tcW w:w="2560" w:type="dxa"/>
             <w:shd w:val="clear" w:color="auto" w:fill="D9E2F3"/>
             <w:vAlign w:val="center"/>
           </w:tcPr>
@@ -14171,7 +14213,7 @@
         </w:trPr>
         <w:tc>
           <w:tcPr>
-            <w:tcW w:w="2433" w:type="dxa"/>
+            <w:tcW w:w="2600" w:type="dxa"/>
             <w:vAlign w:val="center"/>
           </w:tcPr>
           <w:p>
@@ -14190,7 +14232,7 @@
         </w:tc>
         <w:tc>
           <w:tcPr>
-            <w:tcW w:w="2433" w:type="dxa"/>
+            <w:tcW w:w="2100" w:type="dxa"/>
             <w:vAlign w:val="center"/>
           </w:tcPr>
           <w:p>
@@ -14209,7 +14251,7 @@
         </w:tc>
         <w:tc>
           <w:tcPr>
-            <w:tcW w:w="2433" w:type="dxa"/>
+            <w:tcW w:w="2100" w:type="dxa"/>
             <w:vAlign w:val="center"/>
           </w:tcPr>
           <w:p>
@@ -14228,7 +14270,7 @@
         </w:tc>
         <w:tc>
           <w:tcPr>
-            <w:tcW w:w="2059" w:type="dxa"/>
+            <w:tcW w:w="2560" w:type="dxa"/>
             <w:vAlign w:val="center"/>
           </w:tcPr>
           <w:p>
@@ -14240,7 +14282,7 @@
                 <w:rFonts w:ascii="Consolas" w:hAnsi="Consolas" w:cs="Consolas"/>
                 <w:lang w:val="vi-VN"/>
               </w:rPr>
-              <w:t>generated_static_results.json</w:t>
+              <w:t>generated_​static_results.json</w:t>
             </w:r>
           </w:p>
         </w:tc>
@@ -14251,7 +14293,7 @@
         </w:trPr>
         <w:tc>
           <w:tcPr>
-            <w:tcW w:w="2433" w:type="dxa"/>
+            <w:tcW w:w="2600" w:type="dxa"/>
             <w:vAlign w:val="center"/>
           </w:tcPr>
           <w:p>
@@ -14270,7 +14312,7 @@
         </w:tc>
         <w:tc>
           <w:tcPr>
-            <w:tcW w:w="2433" w:type="dxa"/>
+            <w:tcW w:w="2100" w:type="dxa"/>
             <w:vAlign w:val="center"/>
           </w:tcPr>
           <w:p>
@@ -14289,7 +14331,7 @@
         </w:tc>
         <w:tc>
           <w:tcPr>
-            <w:tcW w:w="2433" w:type="dxa"/>
+            <w:tcW w:w="2100" w:type="dxa"/>
             <w:vAlign w:val="center"/>
           </w:tcPr>
           <w:p>
@@ -14308,7 +14350,7 @@
         </w:tc>
         <w:tc>
           <w:tcPr>
-            <w:tcW w:w="2059" w:type="dxa"/>
+            <w:tcW w:w="2560" w:type="dxa"/>
             <w:vAlign w:val="center"/>
           </w:tcPr>
           <w:p>
@@ -14331,7 +14373,7 @@
         </w:trPr>
         <w:tc>
           <w:tcPr>
-            <w:tcW w:w="2433" w:type="dxa"/>
+            <w:tcW w:w="2600" w:type="dxa"/>
             <w:vAlign w:val="center"/>
           </w:tcPr>
           <w:p>
@@ -14350,7 +14392,7 @@
         </w:tc>
         <w:tc>
           <w:tcPr>
-            <w:tcW w:w="2433" w:type="dxa"/>
+            <w:tcW w:w="2100" w:type="dxa"/>
             <w:vAlign w:val="center"/>
           </w:tcPr>
           <w:p>
@@ -14369,7 +14411,7 @@
         </w:tc>
         <w:tc>
           <w:tcPr>
-            <w:tcW w:w="2433" w:type="dxa"/>
+            <w:tcW w:w="2100" w:type="dxa"/>
             <w:vAlign w:val="center"/>
           </w:tcPr>
           <w:p>
@@ -14388,7 +14430,7 @@
         </w:tc>
         <w:tc>
           <w:tcPr>
-            <w:tcW w:w="2059" w:type="dxa"/>
+            <w:tcW w:w="2560" w:type="dxa"/>
             <w:vAlign w:val="center"/>
           </w:tcPr>
           <w:p>
@@ -14411,7 +14453,7 @@
         </w:trPr>
         <w:tc>
           <w:tcPr>
-            <w:tcW w:w="2433" w:type="dxa"/>
+            <w:tcW w:w="2600" w:type="dxa"/>
             <w:vAlign w:val="center"/>
           </w:tcPr>
           <w:p>
@@ -14429,8 +14471,6 @@
             <w:r>
               <w:rPr>
                 <w:rFonts w:ascii="Consolas" w:hAnsi="Consolas" w:cs="Consolas"/>
-                <w:sz w:val="24"/>
-                <w:szCs w:val="24"/>
               </w:rPr>
               <w:t>executed → all_bound</w:t>
             </w:r>
@@ -14446,7 +14486,7 @@
         </w:tc>
         <w:tc>
           <w:tcPr>
-            <w:tcW w:w="2433" w:type="dxa"/>
+            <w:tcW w:w="2100" w:type="dxa"/>
             <w:vAlign w:val="center"/>
           </w:tcPr>
           <w:p>
@@ -14465,7 +14505,7 @@
         </w:tc>
         <w:tc>
           <w:tcPr>
-            <w:tcW w:w="2433" w:type="dxa"/>
+            <w:tcW w:w="2100" w:type="dxa"/>
             <w:vAlign w:val="center"/>
           </w:tcPr>
           <w:p>
@@ -14484,7 +14524,7 @@
         </w:tc>
         <w:tc>
           <w:tcPr>
-            <w:tcW w:w="2059" w:type="dxa"/>
+            <w:tcW w:w="2560" w:type="dxa"/>
             <w:vAlign w:val="center"/>
           </w:tcPr>
           <w:p>
@@ -14507,7 +14547,7 @@
         </w:trPr>
         <w:tc>
           <w:tcPr>
-            <w:tcW w:w="2433" w:type="dxa"/>
+            <w:tcW w:w="2600" w:type="dxa"/>
             <w:vAlign w:val="center"/>
           </w:tcPr>
           <w:p>
@@ -14526,7 +14566,7 @@
         </w:tc>
         <w:tc>
           <w:tcPr>
-            <w:tcW w:w="2433" w:type="dxa"/>
+            <w:tcW w:w="2100" w:type="dxa"/>
             <w:vAlign w:val="center"/>
           </w:tcPr>
           <w:p>
@@ -14545,7 +14585,7 @@
         </w:tc>
         <w:tc>
           <w:tcPr>
-            <w:tcW w:w="2433" w:type="dxa"/>
+            <w:tcW w:w="2100" w:type="dxa"/>
             <w:vAlign w:val="center"/>
           </w:tcPr>
           <w:p>
@@ -14564,7 +14604,7 @@
         </w:tc>
         <w:tc>
           <w:tcPr>
-            <w:tcW w:w="2059" w:type="dxa"/>
+            <w:tcW w:w="2560" w:type="dxa"/>
             <w:vAlign w:val="center"/>
           </w:tcPr>
           <w:p>
@@ -21293,6 +21333,10 @@
 </file>
 
 <file path=customXml/item1.xml><?xml version="1.0" encoding="utf-8"?>
+<b:Sources xmlns:b="http://schemas.openxmlformats.org/officeDocument/2006/bibliography" xmlns="http://schemas.openxmlformats.org/officeDocument/2006/bibliography" SelectedStyle="\APASixthEditionOfficeOnline.xsl" StyleName="APA" Version="6"/>
+</file>
+
+<file path=customXml/item2.xml><?xml version="1.0" encoding="utf-8"?>
 <ct:contentTypeSchema xmlns:ct="http://schemas.microsoft.com/office/2006/metadata/contentType" xmlns:ma="http://schemas.microsoft.com/office/2006/metadata/properties/metaAttributes" ct:_="" ma:_="" ma:contentTypeName="Tài liệu" ma:contentTypeID="0x0101009064D6C488808240A931504663625519" ma:contentTypeVersion="14" ma:contentTypeDescription="Tạo tài liệu mới." ma:contentTypeScope="" ma:versionID="917cc4c3b82354d7a8f69433fdf51fae">
   <xsd:schema xmlns:xsd="http://www.w3.org/2001/XMLSchema" xmlns:xs="http://www.w3.org/2001/XMLSchema" xmlns:p="http://schemas.microsoft.com/office/2006/metadata/properties" xmlns:ns2="f6f721e1-8a62-40be-993d-f44352021507" xmlns:ns3="5d0b22ea-e5ea-49c7-9b62-902e21e51f08" targetNamespace="http://schemas.microsoft.com/office/2006/metadata/properties" ma:root="true" ma:fieldsID="2f9312a3ec803083f43100d41fb65ef5" ns2:_="" ns3:_="">
     <xsd:import namespace="f6f721e1-8a62-40be-993d-f44352021507"/>
@@ -21521,11 +21565,16 @@
 </ct:contentTypeSchema>
 </file>
 
-<file path=customXml/item2.xml><?xml version="1.0" encoding="utf-8"?>
-<b:Sources xmlns:b="http://schemas.openxmlformats.org/officeDocument/2006/bibliography" xmlns="http://schemas.openxmlformats.org/officeDocument/2006/bibliography" SelectedStyle="\APASixthEditionOfficeOnline.xsl" StyleName="APA" Version="6"/>
+<file path=customXml/item3.xml><?xml version="1.0" encoding="utf-8"?>
+<?mso-contentType ?>
+<FormTemplates xmlns="http://schemas.microsoft.com/sharepoint/v3/contenttype/forms">
+  <Display>DocumentLibraryForm</Display>
+  <Edit>DocumentLibraryForm</Edit>
+  <New>DocumentLibraryForm</New>
+</FormTemplates>
 </file>
 
-<file path=customXml/item3.xml><?xml version="1.0" encoding="utf-8"?>
+<file path=customXml/item4.xml><?xml version="1.0" encoding="utf-8"?>
 <p:properties xmlns:p="http://schemas.microsoft.com/office/2006/metadata/properties" xmlns:xsi="http://www.w3.org/2001/XMLSchema-instance" xmlns:pc="http://schemas.microsoft.com/office/infopath/2007/PartnerControls">
   <documentManagement>
     <TaxCatchAll xmlns="5d0b22ea-e5ea-49c7-9b62-902e21e51f08" xsi:nil="true"/>
@@ -21536,16 +21585,15 @@
 </p:properties>
 </file>
 
-<file path=customXml/item4.xml><?xml version="1.0" encoding="utf-8"?>
-<?mso-contentType ?>
-<FormTemplates xmlns="http://schemas.microsoft.com/sharepoint/v3/contenttype/forms">
-  <Display>DocumentLibraryForm</Display>
-  <Edit>DocumentLibraryForm</Edit>
-  <New>DocumentLibraryForm</New>
-</FormTemplates>
+<file path=customXml/itemProps1.xml><?xml version="1.0" encoding="utf-8"?>
+<ds:datastoreItem xmlns:ds="http://schemas.openxmlformats.org/officeDocument/2006/customXml" ds:itemID="{06F34B39-710A-4AE8-9B09-0F6110FECC4E}">
+  <ds:schemaRefs>
+    <ds:schemaRef ds:uri="http://schemas.openxmlformats.org/officeDocument/2006/bibliography"/>
+  </ds:schemaRefs>
+</ds:datastoreItem>
 </file>
 
-<file path=customXml/itemProps1.xml><?xml version="1.0" encoding="utf-8"?>
+<file path=customXml/itemProps2.xml><?xml version="1.0" encoding="utf-8"?>
 <ds:datastoreItem xmlns:ds="http://schemas.openxmlformats.org/officeDocument/2006/customXml" ds:itemID="{DA04E85B-2A7D-4814-AE68-20A674C21DD2}">
   <ds:schemaRefs>
     <ds:schemaRef ds:uri="http://schemas.microsoft.com/office/2006/metadata/contentType"/>
@@ -21564,15 +21612,15 @@
 </ds:datastoreItem>
 </file>
 
-<file path=customXml/itemProps2.xml><?xml version="1.0" encoding="utf-8"?>
-<ds:datastoreItem xmlns:ds="http://schemas.openxmlformats.org/officeDocument/2006/customXml" ds:itemID="{06F34B39-710A-4AE8-9B09-0F6110FECC4E}">
+<file path=customXml/itemProps3.xml><?xml version="1.0" encoding="utf-8"?>
+<ds:datastoreItem xmlns:ds="http://schemas.openxmlformats.org/officeDocument/2006/customXml" ds:itemID="{4ED417DC-AAC6-4AC2-9B84-BF5AEE7392F8}">
   <ds:schemaRefs>
-    <ds:schemaRef ds:uri="http://schemas.openxmlformats.org/officeDocument/2006/bibliography"/>
+    <ds:schemaRef ds:uri="http://schemas.microsoft.com/sharepoint/v3/contenttype/forms"/>
   </ds:schemaRefs>
 </ds:datastoreItem>
 </file>
 
-<file path=customXml/itemProps3.xml><?xml version="1.0" encoding="utf-8"?>
+<file path=customXml/itemProps4.xml><?xml version="1.0" encoding="utf-8"?>
 <ds:datastoreItem xmlns:ds="http://schemas.openxmlformats.org/officeDocument/2006/customXml" ds:itemID="{ACBFC553-1BE4-4450-B403-7F12C27FE3CA}">
   <ds:schemaRefs>
     <ds:schemaRef ds:uri="http://schemas.microsoft.com/office/2006/metadata/properties"/>
@@ -21581,12 +21629,4 @@
     <ds:schemaRef ds:uri="f6f721e1-8a62-40be-993d-f44352021507"/>
   </ds:schemaRefs>
 </ds:datastoreItem>
-</file>
-
-<file path=customXml/itemProps4.xml><?xml version="1.0" encoding="utf-8"?>
-<ds:datastoreItem xmlns:ds="http://schemas.openxmlformats.org/officeDocument/2006/customXml" ds:itemID="{4ED417DC-AAC6-4AC2-9B84-BF5AEE7392F8}">
-  <ds:schemaRefs>
-    <ds:schemaRef ds:uri="http://schemas.microsoft.com/sharepoint/v3/contenttype/forms"/>
-  </ds:schemaRefs>
-</ds:datastoreItem>
 </file>
</xml_diff>